<commit_message>
added my prototype link and screenshots to the doc
</commit_message>
<xml_diff>
--- a/documents/prototypes.docx
+++ b/documents/prototypes.docx
@@ -10,7 +10,6 @@
         <w:tblCellMar>
           <w:top w:w="50" w:type="dxa"/>
           <w:left w:w="30" w:type="dxa"/>
-          <w:bottom w:w="0" w:type="dxa"/>
           <w:right w:w="3242" w:type="dxa"/>
         </w:tblCellMar>
         <w:tblLook w:val="04A0" w:firstRow="1" w:lastRow="0" w:firstColumn="1" w:lastColumn="0" w:noHBand="0" w:noVBand="1"/>
@@ -136,6 +135,7 @@
               </w:rPr>
               <w:t xml:space="preserve">Project Name:  </w:t>
             </w:r>
+            <w:proofErr w:type="spellStart"/>
             <w:r>
               <w:rPr>
                 <w:rFonts w:ascii="Calibri" w:eastAsia="Calibri" w:hAnsi="Calibri" w:cs="Calibri"/>
@@ -146,6 +146,7 @@
               </w:rPr>
               <w:t>YourAverageGamer</w:t>
             </w:r>
+            <w:proofErr w:type="spellEnd"/>
           </w:p>
           <w:p>
             <w:pPr>
@@ -199,13 +200,23 @@
             <w:pPr>
               <w:ind w:left="0"/>
             </w:pPr>
+            <w:proofErr w:type="spellStart"/>
             <w:r>
               <w:rPr>
                 <w:rFonts w:ascii="Calibri" w:eastAsia="Calibri" w:hAnsi="Calibri" w:cs="Calibri"/>
                 <w:color w:val="1D2125"/>
                 <w:sz w:val="24"/>
               </w:rPr>
-              <w:t xml:space="preserve">Github repo URL:  </w:t>
+              <w:t>Github</w:t>
+            </w:r>
+            <w:proofErr w:type="spellEnd"/>
+            <w:r>
+              <w:rPr>
+                <w:rFonts w:ascii="Calibri" w:eastAsia="Calibri" w:hAnsi="Calibri" w:cs="Calibri"/>
+                <w:color w:val="1D2125"/>
+                <w:sz w:val="24"/>
+              </w:rPr>
+              <w:t xml:space="preserve"> repo URL:  </w:t>
             </w:r>
             <w:r>
               <w:rPr>
@@ -240,7 +251,6 @@
         <w:tblCellMar>
           <w:top w:w="50" w:type="dxa"/>
           <w:left w:w="105" w:type="dxa"/>
-          <w:bottom w:w="0" w:type="dxa"/>
           <w:right w:w="115" w:type="dxa"/>
         </w:tblCellMar>
         <w:tblLook w:val="04A0" w:firstRow="1" w:lastRow="0" w:firstColumn="1" w:lastColumn="0" w:noHBand="0" w:noVBand="1"/>
@@ -532,14 +542,13 @@
         <w:tblCellMar>
           <w:top w:w="50" w:type="dxa"/>
           <w:left w:w="11" w:type="dxa"/>
-          <w:bottom w:w="0" w:type="dxa"/>
           <w:right w:w="115" w:type="dxa"/>
         </w:tblCellMar>
         <w:tblLook w:val="04A0" w:firstRow="1" w:lastRow="0" w:firstColumn="1" w:lastColumn="0" w:noHBand="0" w:noVBand="1"/>
       </w:tblPr>
       <w:tblGrid>
-        <w:gridCol w:w="9025"/>
-        <w:gridCol w:w="367"/>
+        <w:gridCol w:w="16121"/>
+        <w:gridCol w:w="225"/>
       </w:tblGrid>
       <w:tr>
         <w:trPr>
@@ -669,7 +678,15 @@
                 <w:color w:val="1D2125"/>
                 <w:sz w:val="24"/>
               </w:rPr>
-              <w:t xml:space="preserve">Member 1 name here </w:t>
+              <w:t>Jermaine Jackson</w:t>
+            </w:r>
+            <w:r>
+              <w:rPr>
+                <w:rFonts w:ascii="Calibri" w:eastAsia="Calibri" w:hAnsi="Calibri" w:cs="Calibri"/>
+                <w:color w:val="1D2125"/>
+                <w:sz w:val="24"/>
+              </w:rPr>
+              <w:t xml:space="preserve"> </w:t>
             </w:r>
           </w:p>
         </w:tc>
@@ -710,32 +727,1383 @@
             <w:pPr>
               <w:ind w:left="115" w:right="6520"/>
             </w:pPr>
-            <w:r>
-              <w:rPr>
-                <w:rFonts w:ascii="Calibri" w:eastAsia="Calibri" w:hAnsi="Calibri" w:cs="Calibri"/>
-                <w:b w:val="0"/>
-                <w:i/>
-                <w:color w:val="1D2125"/>
-                <w:sz w:val="24"/>
-              </w:rPr>
-              <w:t>Prototype link here</w:t>
-            </w:r>
-            <w:r>
-              <w:rPr>
-                <w:b w:val="0"/>
-              </w:rPr>
-              <w:t xml:space="preserve"> </w:t>
-            </w:r>
-            <w:r>
-              <w:rPr>
-                <w:rFonts w:ascii="Calibri" w:eastAsia="Calibri" w:hAnsi="Calibri" w:cs="Calibri"/>
-                <w:b w:val="0"/>
-                <w:i/>
-                <w:color w:val="1D2125"/>
-                <w:sz w:val="24"/>
-              </w:rPr>
-              <w:t xml:space="preserve">All screenshots here </w:t>
-            </w:r>
+            <w:hyperlink r:id="rId4" w:history="1">
+              <w:r>
+                <w:rPr>
+                  <w:rStyle w:val="Hyperlink"/>
+                </w:rPr>
+                <w:t>https://www.figma.com/p</w:t>
+              </w:r>
+              <w:r>
+                <w:rPr>
+                  <w:rStyle w:val="Hyperlink"/>
+                </w:rPr>
+                <w:t>r</w:t>
+              </w:r>
+              <w:r>
+                <w:rPr>
+                  <w:rStyle w:val="Hyperlink"/>
+                </w:rPr>
+                <w:t>oto/e7a0u8bAjf2bvAFFxIlIWE/P1A5?node-id=1-3094&amp;t=OrDuZe0z94Jdm56x-1</w:t>
+              </w:r>
+            </w:hyperlink>
+          </w:p>
+          <w:p>
+            <w:pPr>
+              <w:ind w:left="115" w:right="6520"/>
+            </w:pPr>
+            <w:r>
+              <w:rPr>
+                <w:noProof/>
+              </w:rPr>
+              <w:lastRenderedPageBreak/>
+              <w:drawing>
+                <wp:inline distT="0" distB="0" distL="0" distR="0" wp14:anchorId="5EC91DB7" wp14:editId="0FA5F575">
+                  <wp:extent cx="5943600" cy="6860540"/>
+                  <wp:effectExtent l="0" t="0" r="0" b="0"/>
+                  <wp:docPr id="1590210833" name="Picture 1"/>
+                  <wp:cNvGraphicFramePr>
+                    <a:graphicFrameLocks xmlns:a="http://schemas.openxmlformats.org/drawingml/2006/main" noChangeAspect="1"/>
+                  </wp:cNvGraphicFramePr>
+                  <a:graphic xmlns:a="http://schemas.openxmlformats.org/drawingml/2006/main">
+                    <a:graphicData uri="http://schemas.openxmlformats.org/drawingml/2006/picture">
+                      <pic:pic xmlns:pic="http://schemas.openxmlformats.org/drawingml/2006/picture">
+                        <pic:nvPicPr>
+                          <pic:cNvPr id="1590210833" name="Picture 1590210833"/>
+                          <pic:cNvPicPr/>
+                        </pic:nvPicPr>
+                        <pic:blipFill>
+                          <a:blip r:embed="rId5">
+                            <a:extLst>
+                              <a:ext uri="{28A0092B-C50C-407E-A947-70E740481C1C}">
+                                <a14:useLocalDpi xmlns:a14="http://schemas.microsoft.com/office/drawing/2010/main" val="0"/>
+                              </a:ext>
+                            </a:extLst>
+                          </a:blip>
+                          <a:stretch>
+                            <a:fillRect/>
+                          </a:stretch>
+                        </pic:blipFill>
+                        <pic:spPr>
+                          <a:xfrm>
+                            <a:off x="0" y="0"/>
+                            <a:ext cx="5943600" cy="6860540"/>
+                          </a:xfrm>
+                          <a:prstGeom prst="rect">
+                            <a:avLst/>
+                          </a:prstGeom>
+                        </pic:spPr>
+                      </pic:pic>
+                    </a:graphicData>
+                  </a:graphic>
+                </wp:inline>
+              </w:drawing>
+            </w:r>
+          </w:p>
+          <w:p>
+            <w:pPr>
+              <w:ind w:left="115" w:right="6520"/>
+            </w:pPr>
+            <w:r>
+              <w:rPr>
+                <w:noProof/>
+              </w:rPr>
+              <w:lastRenderedPageBreak/>
+              <w:drawing>
+                <wp:inline distT="0" distB="0" distL="0" distR="0" wp14:anchorId="2BE3F96F" wp14:editId="15B7ED9E">
+                  <wp:extent cx="5715635" cy="8413115"/>
+                  <wp:effectExtent l="0" t="0" r="0" b="6985"/>
+                  <wp:docPr id="683194735" name="Picture 2"/>
+                  <wp:cNvGraphicFramePr>
+                    <a:graphicFrameLocks xmlns:a="http://schemas.openxmlformats.org/drawingml/2006/main" noChangeAspect="1"/>
+                  </wp:cNvGraphicFramePr>
+                  <a:graphic xmlns:a="http://schemas.openxmlformats.org/drawingml/2006/main">
+                    <a:graphicData uri="http://schemas.openxmlformats.org/drawingml/2006/picture">
+                      <pic:pic xmlns:pic="http://schemas.openxmlformats.org/drawingml/2006/picture">
+                        <pic:nvPicPr>
+                          <pic:cNvPr id="683194735" name="Picture 683194735"/>
+                          <pic:cNvPicPr/>
+                        </pic:nvPicPr>
+                        <pic:blipFill>
+                          <a:blip r:embed="rId6">
+                            <a:extLst>
+                              <a:ext uri="{28A0092B-C50C-407E-A947-70E740481C1C}">
+                                <a14:useLocalDpi xmlns:a14="http://schemas.microsoft.com/office/drawing/2010/main" val="0"/>
+                              </a:ext>
+                            </a:extLst>
+                          </a:blip>
+                          <a:stretch>
+                            <a:fillRect/>
+                          </a:stretch>
+                        </pic:blipFill>
+                        <pic:spPr>
+                          <a:xfrm>
+                            <a:off x="0" y="0"/>
+                            <a:ext cx="5715635" cy="8413115"/>
+                          </a:xfrm>
+                          <a:prstGeom prst="rect">
+                            <a:avLst/>
+                          </a:prstGeom>
+                        </pic:spPr>
+                      </pic:pic>
+                    </a:graphicData>
+                  </a:graphic>
+                </wp:inline>
+              </w:drawing>
+            </w:r>
+          </w:p>
+          <w:p>
+            <w:pPr>
+              <w:ind w:left="115" w:right="6520"/>
+            </w:pPr>
+            <w:r>
+              <w:rPr>
+                <w:noProof/>
+              </w:rPr>
+              <w:lastRenderedPageBreak/>
+              <w:drawing>
+                <wp:inline distT="0" distB="0" distL="0" distR="0" wp14:anchorId="272E82AB" wp14:editId="783FDC56">
+                  <wp:extent cx="5943600" cy="7855585"/>
+                  <wp:effectExtent l="0" t="0" r="0" b="0"/>
+                  <wp:docPr id="264862659" name="Picture 3"/>
+                  <wp:cNvGraphicFramePr>
+                    <a:graphicFrameLocks xmlns:a="http://schemas.openxmlformats.org/drawingml/2006/main" noChangeAspect="1"/>
+                  </wp:cNvGraphicFramePr>
+                  <a:graphic xmlns:a="http://schemas.openxmlformats.org/drawingml/2006/main">
+                    <a:graphicData uri="http://schemas.openxmlformats.org/drawingml/2006/picture">
+                      <pic:pic xmlns:pic="http://schemas.openxmlformats.org/drawingml/2006/picture">
+                        <pic:nvPicPr>
+                          <pic:cNvPr id="264862659" name="Picture 264862659"/>
+                          <pic:cNvPicPr/>
+                        </pic:nvPicPr>
+                        <pic:blipFill>
+                          <a:blip r:embed="rId7">
+                            <a:extLst>
+                              <a:ext uri="{28A0092B-C50C-407E-A947-70E740481C1C}">
+                                <a14:useLocalDpi xmlns:a14="http://schemas.microsoft.com/office/drawing/2010/main" val="0"/>
+                              </a:ext>
+                            </a:extLst>
+                          </a:blip>
+                          <a:stretch>
+                            <a:fillRect/>
+                          </a:stretch>
+                        </pic:blipFill>
+                        <pic:spPr>
+                          <a:xfrm>
+                            <a:off x="0" y="0"/>
+                            <a:ext cx="5943600" cy="7855585"/>
+                          </a:xfrm>
+                          <a:prstGeom prst="rect">
+                            <a:avLst/>
+                          </a:prstGeom>
+                        </pic:spPr>
+                      </pic:pic>
+                    </a:graphicData>
+                  </a:graphic>
+                </wp:inline>
+              </w:drawing>
+            </w:r>
+          </w:p>
+          <w:p>
+            <w:pPr>
+              <w:ind w:left="115" w:right="6520"/>
+            </w:pPr>
+            <w:r>
+              <w:rPr>
+                <w:noProof/>
+              </w:rPr>
+              <w:lastRenderedPageBreak/>
+              <w:drawing>
+                <wp:inline distT="0" distB="0" distL="0" distR="0" wp14:anchorId="372FFCB4" wp14:editId="6B16601B">
+                  <wp:extent cx="5943600" cy="7759065"/>
+                  <wp:effectExtent l="0" t="0" r="0" b="0"/>
+                  <wp:docPr id="740298264" name="Picture 4"/>
+                  <wp:cNvGraphicFramePr>
+                    <a:graphicFrameLocks xmlns:a="http://schemas.openxmlformats.org/drawingml/2006/main" noChangeAspect="1"/>
+                  </wp:cNvGraphicFramePr>
+                  <a:graphic xmlns:a="http://schemas.openxmlformats.org/drawingml/2006/main">
+                    <a:graphicData uri="http://schemas.openxmlformats.org/drawingml/2006/picture">
+                      <pic:pic xmlns:pic="http://schemas.openxmlformats.org/drawingml/2006/picture">
+                        <pic:nvPicPr>
+                          <pic:cNvPr id="740298264" name="Picture 740298264"/>
+                          <pic:cNvPicPr/>
+                        </pic:nvPicPr>
+                        <pic:blipFill>
+                          <a:blip r:embed="rId8">
+                            <a:extLst>
+                              <a:ext uri="{28A0092B-C50C-407E-A947-70E740481C1C}">
+                                <a14:useLocalDpi xmlns:a14="http://schemas.microsoft.com/office/drawing/2010/main" val="0"/>
+                              </a:ext>
+                            </a:extLst>
+                          </a:blip>
+                          <a:stretch>
+                            <a:fillRect/>
+                          </a:stretch>
+                        </pic:blipFill>
+                        <pic:spPr>
+                          <a:xfrm>
+                            <a:off x="0" y="0"/>
+                            <a:ext cx="5943600" cy="7759065"/>
+                          </a:xfrm>
+                          <a:prstGeom prst="rect">
+                            <a:avLst/>
+                          </a:prstGeom>
+                        </pic:spPr>
+                      </pic:pic>
+                    </a:graphicData>
+                  </a:graphic>
+                </wp:inline>
+              </w:drawing>
+            </w:r>
+          </w:p>
+          <w:p>
+            <w:pPr>
+              <w:ind w:left="115" w:right="6520"/>
+            </w:pPr>
+            <w:r>
+              <w:rPr>
+                <w:noProof/>
+              </w:rPr>
+              <w:lastRenderedPageBreak/>
+              <w:drawing>
+                <wp:inline distT="0" distB="0" distL="0" distR="0" wp14:anchorId="7E8F30AA" wp14:editId="0921A9C5">
+                  <wp:extent cx="5943600" cy="7789545"/>
+                  <wp:effectExtent l="0" t="0" r="0" b="1905"/>
+                  <wp:docPr id="55687463" name="Picture 5"/>
+                  <wp:cNvGraphicFramePr>
+                    <a:graphicFrameLocks xmlns:a="http://schemas.openxmlformats.org/drawingml/2006/main" noChangeAspect="1"/>
+                  </wp:cNvGraphicFramePr>
+                  <a:graphic xmlns:a="http://schemas.openxmlformats.org/drawingml/2006/main">
+                    <a:graphicData uri="http://schemas.openxmlformats.org/drawingml/2006/picture">
+                      <pic:pic xmlns:pic="http://schemas.openxmlformats.org/drawingml/2006/picture">
+                        <pic:nvPicPr>
+                          <pic:cNvPr id="55687463" name="Picture 55687463"/>
+                          <pic:cNvPicPr/>
+                        </pic:nvPicPr>
+                        <pic:blipFill>
+                          <a:blip r:embed="rId9">
+                            <a:extLst>
+                              <a:ext uri="{28A0092B-C50C-407E-A947-70E740481C1C}">
+                                <a14:useLocalDpi xmlns:a14="http://schemas.microsoft.com/office/drawing/2010/main" val="0"/>
+                              </a:ext>
+                            </a:extLst>
+                          </a:blip>
+                          <a:stretch>
+                            <a:fillRect/>
+                          </a:stretch>
+                        </pic:blipFill>
+                        <pic:spPr>
+                          <a:xfrm>
+                            <a:off x="0" y="0"/>
+                            <a:ext cx="5943600" cy="7789545"/>
+                          </a:xfrm>
+                          <a:prstGeom prst="rect">
+                            <a:avLst/>
+                          </a:prstGeom>
+                        </pic:spPr>
+                      </pic:pic>
+                    </a:graphicData>
+                  </a:graphic>
+                </wp:inline>
+              </w:drawing>
+            </w:r>
+          </w:p>
+          <w:p>
+            <w:pPr>
+              <w:ind w:left="115" w:right="6520"/>
+            </w:pPr>
+            <w:r>
+              <w:rPr>
+                <w:noProof/>
+              </w:rPr>
+              <w:lastRenderedPageBreak/>
+              <w:drawing>
+                <wp:inline distT="0" distB="0" distL="0" distR="0" wp14:anchorId="650369FD" wp14:editId="2D019459">
+                  <wp:extent cx="5943600" cy="7616190"/>
+                  <wp:effectExtent l="0" t="0" r="0" b="3810"/>
+                  <wp:docPr id="350699225" name="Picture 6"/>
+                  <wp:cNvGraphicFramePr>
+                    <a:graphicFrameLocks xmlns:a="http://schemas.openxmlformats.org/drawingml/2006/main" noChangeAspect="1"/>
+                  </wp:cNvGraphicFramePr>
+                  <a:graphic xmlns:a="http://schemas.openxmlformats.org/drawingml/2006/main">
+                    <a:graphicData uri="http://schemas.openxmlformats.org/drawingml/2006/picture">
+                      <pic:pic xmlns:pic="http://schemas.openxmlformats.org/drawingml/2006/picture">
+                        <pic:nvPicPr>
+                          <pic:cNvPr id="350699225" name="Picture 350699225"/>
+                          <pic:cNvPicPr/>
+                        </pic:nvPicPr>
+                        <pic:blipFill>
+                          <a:blip r:embed="rId10">
+                            <a:extLst>
+                              <a:ext uri="{28A0092B-C50C-407E-A947-70E740481C1C}">
+                                <a14:useLocalDpi xmlns:a14="http://schemas.microsoft.com/office/drawing/2010/main" val="0"/>
+                              </a:ext>
+                            </a:extLst>
+                          </a:blip>
+                          <a:stretch>
+                            <a:fillRect/>
+                          </a:stretch>
+                        </pic:blipFill>
+                        <pic:spPr>
+                          <a:xfrm>
+                            <a:off x="0" y="0"/>
+                            <a:ext cx="5943600" cy="7616190"/>
+                          </a:xfrm>
+                          <a:prstGeom prst="rect">
+                            <a:avLst/>
+                          </a:prstGeom>
+                        </pic:spPr>
+                      </pic:pic>
+                    </a:graphicData>
+                  </a:graphic>
+                </wp:inline>
+              </w:drawing>
+            </w:r>
+          </w:p>
+          <w:p>
+            <w:pPr>
+              <w:ind w:left="115" w:right="6520"/>
+            </w:pPr>
+            <w:r>
+              <w:rPr>
+                <w:noProof/>
+              </w:rPr>
+              <w:lastRenderedPageBreak/>
+              <w:drawing>
+                <wp:inline distT="0" distB="0" distL="0" distR="0" wp14:anchorId="63C88243" wp14:editId="574A593F">
+                  <wp:extent cx="5943600" cy="7595235"/>
+                  <wp:effectExtent l="0" t="0" r="0" b="5715"/>
+                  <wp:docPr id="897309406" name="Picture 7"/>
+                  <wp:cNvGraphicFramePr>
+                    <a:graphicFrameLocks xmlns:a="http://schemas.openxmlformats.org/drawingml/2006/main" noChangeAspect="1"/>
+                  </wp:cNvGraphicFramePr>
+                  <a:graphic xmlns:a="http://schemas.openxmlformats.org/drawingml/2006/main">
+                    <a:graphicData uri="http://schemas.openxmlformats.org/drawingml/2006/picture">
+                      <pic:pic xmlns:pic="http://schemas.openxmlformats.org/drawingml/2006/picture">
+                        <pic:nvPicPr>
+                          <pic:cNvPr id="897309406" name="Picture 897309406"/>
+                          <pic:cNvPicPr/>
+                        </pic:nvPicPr>
+                        <pic:blipFill>
+                          <a:blip r:embed="rId11">
+                            <a:extLst>
+                              <a:ext uri="{28A0092B-C50C-407E-A947-70E740481C1C}">
+                                <a14:useLocalDpi xmlns:a14="http://schemas.microsoft.com/office/drawing/2010/main" val="0"/>
+                              </a:ext>
+                            </a:extLst>
+                          </a:blip>
+                          <a:stretch>
+                            <a:fillRect/>
+                          </a:stretch>
+                        </pic:blipFill>
+                        <pic:spPr>
+                          <a:xfrm>
+                            <a:off x="0" y="0"/>
+                            <a:ext cx="5943600" cy="7595235"/>
+                          </a:xfrm>
+                          <a:prstGeom prst="rect">
+                            <a:avLst/>
+                          </a:prstGeom>
+                        </pic:spPr>
+                      </pic:pic>
+                    </a:graphicData>
+                  </a:graphic>
+                </wp:inline>
+              </w:drawing>
+            </w:r>
+          </w:p>
+          <w:p>
+            <w:pPr>
+              <w:ind w:left="115" w:right="6520"/>
+            </w:pPr>
+            <w:r>
+              <w:rPr>
+                <w:noProof/>
+              </w:rPr>
+              <w:lastRenderedPageBreak/>
+              <w:drawing>
+                <wp:inline distT="0" distB="0" distL="0" distR="0" wp14:anchorId="1373FA31" wp14:editId="37390AD1">
+                  <wp:extent cx="5943600" cy="7842250"/>
+                  <wp:effectExtent l="0" t="0" r="0" b="6350"/>
+                  <wp:docPr id="1506784068" name="Picture 8"/>
+                  <wp:cNvGraphicFramePr>
+                    <a:graphicFrameLocks xmlns:a="http://schemas.openxmlformats.org/drawingml/2006/main" noChangeAspect="1"/>
+                  </wp:cNvGraphicFramePr>
+                  <a:graphic xmlns:a="http://schemas.openxmlformats.org/drawingml/2006/main">
+                    <a:graphicData uri="http://schemas.openxmlformats.org/drawingml/2006/picture">
+                      <pic:pic xmlns:pic="http://schemas.openxmlformats.org/drawingml/2006/picture">
+                        <pic:nvPicPr>
+                          <pic:cNvPr id="1506784068" name="Picture 1506784068"/>
+                          <pic:cNvPicPr/>
+                        </pic:nvPicPr>
+                        <pic:blipFill>
+                          <a:blip r:embed="rId12">
+                            <a:extLst>
+                              <a:ext uri="{28A0092B-C50C-407E-A947-70E740481C1C}">
+                                <a14:useLocalDpi xmlns:a14="http://schemas.microsoft.com/office/drawing/2010/main" val="0"/>
+                              </a:ext>
+                            </a:extLst>
+                          </a:blip>
+                          <a:stretch>
+                            <a:fillRect/>
+                          </a:stretch>
+                        </pic:blipFill>
+                        <pic:spPr>
+                          <a:xfrm>
+                            <a:off x="0" y="0"/>
+                            <a:ext cx="5943600" cy="7842250"/>
+                          </a:xfrm>
+                          <a:prstGeom prst="rect">
+                            <a:avLst/>
+                          </a:prstGeom>
+                        </pic:spPr>
+                      </pic:pic>
+                    </a:graphicData>
+                  </a:graphic>
+                </wp:inline>
+              </w:drawing>
+            </w:r>
+          </w:p>
+          <w:p>
+            <w:pPr>
+              <w:ind w:left="115" w:right="6520"/>
+            </w:pPr>
+            <w:r>
+              <w:rPr>
+                <w:noProof/>
+              </w:rPr>
+              <w:lastRenderedPageBreak/>
+              <w:drawing>
+                <wp:inline distT="0" distB="0" distL="0" distR="0" wp14:anchorId="3D4C6D1D" wp14:editId="517F248F">
+                  <wp:extent cx="5943600" cy="7964170"/>
+                  <wp:effectExtent l="0" t="0" r="0" b="0"/>
+                  <wp:docPr id="658983452" name="Picture 9"/>
+                  <wp:cNvGraphicFramePr>
+                    <a:graphicFrameLocks xmlns:a="http://schemas.openxmlformats.org/drawingml/2006/main" noChangeAspect="1"/>
+                  </wp:cNvGraphicFramePr>
+                  <a:graphic xmlns:a="http://schemas.openxmlformats.org/drawingml/2006/main">
+                    <a:graphicData uri="http://schemas.openxmlformats.org/drawingml/2006/picture">
+                      <pic:pic xmlns:pic="http://schemas.openxmlformats.org/drawingml/2006/picture">
+                        <pic:nvPicPr>
+                          <pic:cNvPr id="658983452" name="Picture 658983452"/>
+                          <pic:cNvPicPr/>
+                        </pic:nvPicPr>
+                        <pic:blipFill>
+                          <a:blip r:embed="rId13">
+                            <a:extLst>
+                              <a:ext uri="{28A0092B-C50C-407E-A947-70E740481C1C}">
+                                <a14:useLocalDpi xmlns:a14="http://schemas.microsoft.com/office/drawing/2010/main" val="0"/>
+                              </a:ext>
+                            </a:extLst>
+                          </a:blip>
+                          <a:stretch>
+                            <a:fillRect/>
+                          </a:stretch>
+                        </pic:blipFill>
+                        <pic:spPr>
+                          <a:xfrm>
+                            <a:off x="0" y="0"/>
+                            <a:ext cx="5943600" cy="7964170"/>
+                          </a:xfrm>
+                          <a:prstGeom prst="rect">
+                            <a:avLst/>
+                          </a:prstGeom>
+                        </pic:spPr>
+                      </pic:pic>
+                    </a:graphicData>
+                  </a:graphic>
+                </wp:inline>
+              </w:drawing>
+            </w:r>
+          </w:p>
+          <w:p>
+            <w:pPr>
+              <w:ind w:left="115" w:right="6520"/>
+            </w:pPr>
+            <w:r>
+              <w:rPr>
+                <w:noProof/>
+              </w:rPr>
+              <w:lastRenderedPageBreak/>
+              <w:drawing>
+                <wp:inline distT="0" distB="0" distL="0" distR="0" wp14:anchorId="5A316147" wp14:editId="0AB8F958">
+                  <wp:extent cx="5943600" cy="7819390"/>
+                  <wp:effectExtent l="0" t="0" r="0" b="0"/>
+                  <wp:docPr id="1864540404" name="Picture 10"/>
+                  <wp:cNvGraphicFramePr>
+                    <a:graphicFrameLocks xmlns:a="http://schemas.openxmlformats.org/drawingml/2006/main" noChangeAspect="1"/>
+                  </wp:cNvGraphicFramePr>
+                  <a:graphic xmlns:a="http://schemas.openxmlformats.org/drawingml/2006/main">
+                    <a:graphicData uri="http://schemas.openxmlformats.org/drawingml/2006/picture">
+                      <pic:pic xmlns:pic="http://schemas.openxmlformats.org/drawingml/2006/picture">
+                        <pic:nvPicPr>
+                          <pic:cNvPr id="1864540404" name="Picture 1864540404"/>
+                          <pic:cNvPicPr/>
+                        </pic:nvPicPr>
+                        <pic:blipFill>
+                          <a:blip r:embed="rId14">
+                            <a:extLst>
+                              <a:ext uri="{28A0092B-C50C-407E-A947-70E740481C1C}">
+                                <a14:useLocalDpi xmlns:a14="http://schemas.microsoft.com/office/drawing/2010/main" val="0"/>
+                              </a:ext>
+                            </a:extLst>
+                          </a:blip>
+                          <a:stretch>
+                            <a:fillRect/>
+                          </a:stretch>
+                        </pic:blipFill>
+                        <pic:spPr>
+                          <a:xfrm>
+                            <a:off x="0" y="0"/>
+                            <a:ext cx="5943600" cy="7819390"/>
+                          </a:xfrm>
+                          <a:prstGeom prst="rect">
+                            <a:avLst/>
+                          </a:prstGeom>
+                        </pic:spPr>
+                      </pic:pic>
+                    </a:graphicData>
+                  </a:graphic>
+                </wp:inline>
+              </w:drawing>
+            </w:r>
+          </w:p>
+          <w:p>
+            <w:pPr>
+              <w:ind w:left="115" w:right="6520"/>
+            </w:pPr>
+            <w:r>
+              <w:rPr>
+                <w:noProof/>
+              </w:rPr>
+              <w:lastRenderedPageBreak/>
+              <w:drawing>
+                <wp:inline distT="0" distB="0" distL="0" distR="0" wp14:anchorId="0DE6D3EF" wp14:editId="0BE2DC97">
+                  <wp:extent cx="5943600" cy="7695565"/>
+                  <wp:effectExtent l="0" t="0" r="0" b="635"/>
+                  <wp:docPr id="1442645118" name="Picture 11"/>
+                  <wp:cNvGraphicFramePr>
+                    <a:graphicFrameLocks xmlns:a="http://schemas.openxmlformats.org/drawingml/2006/main" noChangeAspect="1"/>
+                  </wp:cNvGraphicFramePr>
+                  <a:graphic xmlns:a="http://schemas.openxmlformats.org/drawingml/2006/main">
+                    <a:graphicData uri="http://schemas.openxmlformats.org/drawingml/2006/picture">
+                      <pic:pic xmlns:pic="http://schemas.openxmlformats.org/drawingml/2006/picture">
+                        <pic:nvPicPr>
+                          <pic:cNvPr id="1442645118" name="Picture 1442645118"/>
+                          <pic:cNvPicPr/>
+                        </pic:nvPicPr>
+                        <pic:blipFill>
+                          <a:blip r:embed="rId15">
+                            <a:extLst>
+                              <a:ext uri="{28A0092B-C50C-407E-A947-70E740481C1C}">
+                                <a14:useLocalDpi xmlns:a14="http://schemas.microsoft.com/office/drawing/2010/main" val="0"/>
+                              </a:ext>
+                            </a:extLst>
+                          </a:blip>
+                          <a:stretch>
+                            <a:fillRect/>
+                          </a:stretch>
+                        </pic:blipFill>
+                        <pic:spPr>
+                          <a:xfrm>
+                            <a:off x="0" y="0"/>
+                            <a:ext cx="5943600" cy="7695565"/>
+                          </a:xfrm>
+                          <a:prstGeom prst="rect">
+                            <a:avLst/>
+                          </a:prstGeom>
+                        </pic:spPr>
+                      </pic:pic>
+                    </a:graphicData>
+                  </a:graphic>
+                </wp:inline>
+              </w:drawing>
+            </w:r>
+          </w:p>
+          <w:p>
+            <w:pPr>
+              <w:ind w:left="115" w:right="6520"/>
+            </w:pPr>
+            <w:r>
+              <w:rPr>
+                <w:noProof/>
+              </w:rPr>
+              <w:lastRenderedPageBreak/>
+              <w:drawing>
+                <wp:inline distT="0" distB="0" distL="0" distR="0" wp14:anchorId="6A11065A" wp14:editId="4ADC935D">
+                  <wp:extent cx="5943600" cy="7768590"/>
+                  <wp:effectExtent l="0" t="0" r="0" b="3810"/>
+                  <wp:docPr id="1373188782" name="Picture 12"/>
+                  <wp:cNvGraphicFramePr>
+                    <a:graphicFrameLocks xmlns:a="http://schemas.openxmlformats.org/drawingml/2006/main" noChangeAspect="1"/>
+                  </wp:cNvGraphicFramePr>
+                  <a:graphic xmlns:a="http://schemas.openxmlformats.org/drawingml/2006/main">
+                    <a:graphicData uri="http://schemas.openxmlformats.org/drawingml/2006/picture">
+                      <pic:pic xmlns:pic="http://schemas.openxmlformats.org/drawingml/2006/picture">
+                        <pic:nvPicPr>
+                          <pic:cNvPr id="1373188782" name="Picture 1373188782"/>
+                          <pic:cNvPicPr/>
+                        </pic:nvPicPr>
+                        <pic:blipFill>
+                          <a:blip r:embed="rId16">
+                            <a:extLst>
+                              <a:ext uri="{28A0092B-C50C-407E-A947-70E740481C1C}">
+                                <a14:useLocalDpi xmlns:a14="http://schemas.microsoft.com/office/drawing/2010/main" val="0"/>
+                              </a:ext>
+                            </a:extLst>
+                          </a:blip>
+                          <a:stretch>
+                            <a:fillRect/>
+                          </a:stretch>
+                        </pic:blipFill>
+                        <pic:spPr>
+                          <a:xfrm>
+                            <a:off x="0" y="0"/>
+                            <a:ext cx="5943600" cy="7768590"/>
+                          </a:xfrm>
+                          <a:prstGeom prst="rect">
+                            <a:avLst/>
+                          </a:prstGeom>
+                        </pic:spPr>
+                      </pic:pic>
+                    </a:graphicData>
+                  </a:graphic>
+                </wp:inline>
+              </w:drawing>
+            </w:r>
+          </w:p>
+          <w:p>
+            <w:pPr>
+              <w:ind w:left="115" w:right="6520"/>
+            </w:pPr>
+            <w:r>
+              <w:rPr>
+                <w:noProof/>
+              </w:rPr>
+              <w:lastRenderedPageBreak/>
+              <w:drawing>
+                <wp:inline distT="0" distB="0" distL="0" distR="0" wp14:anchorId="4FCC140D" wp14:editId="739DE29E">
+                  <wp:extent cx="5943600" cy="7758430"/>
+                  <wp:effectExtent l="0" t="0" r="0" b="0"/>
+                  <wp:docPr id="1045087680" name="Picture 13"/>
+                  <wp:cNvGraphicFramePr>
+                    <a:graphicFrameLocks xmlns:a="http://schemas.openxmlformats.org/drawingml/2006/main" noChangeAspect="1"/>
+                  </wp:cNvGraphicFramePr>
+                  <a:graphic xmlns:a="http://schemas.openxmlformats.org/drawingml/2006/main">
+                    <a:graphicData uri="http://schemas.openxmlformats.org/drawingml/2006/picture">
+                      <pic:pic xmlns:pic="http://schemas.openxmlformats.org/drawingml/2006/picture">
+                        <pic:nvPicPr>
+                          <pic:cNvPr id="1045087680" name="Picture 1045087680"/>
+                          <pic:cNvPicPr/>
+                        </pic:nvPicPr>
+                        <pic:blipFill>
+                          <a:blip r:embed="rId17">
+                            <a:extLst>
+                              <a:ext uri="{28A0092B-C50C-407E-A947-70E740481C1C}">
+                                <a14:useLocalDpi xmlns:a14="http://schemas.microsoft.com/office/drawing/2010/main" val="0"/>
+                              </a:ext>
+                            </a:extLst>
+                          </a:blip>
+                          <a:stretch>
+                            <a:fillRect/>
+                          </a:stretch>
+                        </pic:blipFill>
+                        <pic:spPr>
+                          <a:xfrm>
+                            <a:off x="0" y="0"/>
+                            <a:ext cx="5943600" cy="7758430"/>
+                          </a:xfrm>
+                          <a:prstGeom prst="rect">
+                            <a:avLst/>
+                          </a:prstGeom>
+                        </pic:spPr>
+                      </pic:pic>
+                    </a:graphicData>
+                  </a:graphic>
+                </wp:inline>
+              </w:drawing>
+            </w:r>
+          </w:p>
+          <w:p>
+            <w:pPr>
+              <w:ind w:left="115" w:right="6520"/>
+            </w:pPr>
+            <w:r>
+              <w:rPr>
+                <w:noProof/>
+              </w:rPr>
+              <w:lastRenderedPageBreak/>
+              <w:drawing>
+                <wp:inline distT="0" distB="0" distL="0" distR="0" wp14:anchorId="4C659E23" wp14:editId="2280CF1B">
+                  <wp:extent cx="5943600" cy="7706360"/>
+                  <wp:effectExtent l="0" t="0" r="0" b="8890"/>
+                  <wp:docPr id="1384958377" name="Picture 14"/>
+                  <wp:cNvGraphicFramePr>
+                    <a:graphicFrameLocks xmlns:a="http://schemas.openxmlformats.org/drawingml/2006/main" noChangeAspect="1"/>
+                  </wp:cNvGraphicFramePr>
+                  <a:graphic xmlns:a="http://schemas.openxmlformats.org/drawingml/2006/main">
+                    <a:graphicData uri="http://schemas.openxmlformats.org/drawingml/2006/picture">
+                      <pic:pic xmlns:pic="http://schemas.openxmlformats.org/drawingml/2006/picture">
+                        <pic:nvPicPr>
+                          <pic:cNvPr id="1384958377" name="Picture 1384958377"/>
+                          <pic:cNvPicPr/>
+                        </pic:nvPicPr>
+                        <pic:blipFill>
+                          <a:blip r:embed="rId18">
+                            <a:extLst>
+                              <a:ext uri="{28A0092B-C50C-407E-A947-70E740481C1C}">
+                                <a14:useLocalDpi xmlns:a14="http://schemas.microsoft.com/office/drawing/2010/main" val="0"/>
+                              </a:ext>
+                            </a:extLst>
+                          </a:blip>
+                          <a:stretch>
+                            <a:fillRect/>
+                          </a:stretch>
+                        </pic:blipFill>
+                        <pic:spPr>
+                          <a:xfrm>
+                            <a:off x="0" y="0"/>
+                            <a:ext cx="5943600" cy="7706360"/>
+                          </a:xfrm>
+                          <a:prstGeom prst="rect">
+                            <a:avLst/>
+                          </a:prstGeom>
+                        </pic:spPr>
+                      </pic:pic>
+                    </a:graphicData>
+                  </a:graphic>
+                </wp:inline>
+              </w:drawing>
+            </w:r>
+          </w:p>
+          <w:p>
+            <w:pPr>
+              <w:ind w:left="115" w:right="6520"/>
+            </w:pPr>
+            <w:r>
+              <w:rPr>
+                <w:noProof/>
+              </w:rPr>
+              <w:lastRenderedPageBreak/>
+              <w:drawing>
+                <wp:inline distT="0" distB="0" distL="0" distR="0" wp14:anchorId="1249A7EB" wp14:editId="0E4811EF">
+                  <wp:extent cx="5943600" cy="7609840"/>
+                  <wp:effectExtent l="0" t="0" r="0" b="0"/>
+                  <wp:docPr id="199789094" name="Picture 15"/>
+                  <wp:cNvGraphicFramePr>
+                    <a:graphicFrameLocks xmlns:a="http://schemas.openxmlformats.org/drawingml/2006/main" noChangeAspect="1"/>
+                  </wp:cNvGraphicFramePr>
+                  <a:graphic xmlns:a="http://schemas.openxmlformats.org/drawingml/2006/main">
+                    <a:graphicData uri="http://schemas.openxmlformats.org/drawingml/2006/picture">
+                      <pic:pic xmlns:pic="http://schemas.openxmlformats.org/drawingml/2006/picture">
+                        <pic:nvPicPr>
+                          <pic:cNvPr id="199789094" name="Picture 199789094"/>
+                          <pic:cNvPicPr/>
+                        </pic:nvPicPr>
+                        <pic:blipFill>
+                          <a:blip r:embed="rId19">
+                            <a:extLst>
+                              <a:ext uri="{28A0092B-C50C-407E-A947-70E740481C1C}">
+                                <a14:useLocalDpi xmlns:a14="http://schemas.microsoft.com/office/drawing/2010/main" val="0"/>
+                              </a:ext>
+                            </a:extLst>
+                          </a:blip>
+                          <a:stretch>
+                            <a:fillRect/>
+                          </a:stretch>
+                        </pic:blipFill>
+                        <pic:spPr>
+                          <a:xfrm>
+                            <a:off x="0" y="0"/>
+                            <a:ext cx="5943600" cy="7609840"/>
+                          </a:xfrm>
+                          <a:prstGeom prst="rect">
+                            <a:avLst/>
+                          </a:prstGeom>
+                        </pic:spPr>
+                      </pic:pic>
+                    </a:graphicData>
+                  </a:graphic>
+                </wp:inline>
+              </w:drawing>
+            </w:r>
+          </w:p>
+          <w:p>
+            <w:pPr>
+              <w:ind w:left="115" w:right="6520"/>
+            </w:pPr>
+            <w:r>
+              <w:rPr>
+                <w:noProof/>
+              </w:rPr>
+              <w:lastRenderedPageBreak/>
+              <w:drawing>
+                <wp:inline distT="0" distB="0" distL="0" distR="0" wp14:anchorId="498EFB25" wp14:editId="5A6BE6A0">
+                  <wp:extent cx="5943600" cy="7955915"/>
+                  <wp:effectExtent l="0" t="0" r="0" b="6985"/>
+                  <wp:docPr id="983442121" name="Picture 16"/>
+                  <wp:cNvGraphicFramePr>
+                    <a:graphicFrameLocks xmlns:a="http://schemas.openxmlformats.org/drawingml/2006/main" noChangeAspect="1"/>
+                  </wp:cNvGraphicFramePr>
+                  <a:graphic xmlns:a="http://schemas.openxmlformats.org/drawingml/2006/main">
+                    <a:graphicData uri="http://schemas.openxmlformats.org/drawingml/2006/picture">
+                      <pic:pic xmlns:pic="http://schemas.openxmlformats.org/drawingml/2006/picture">
+                        <pic:nvPicPr>
+                          <pic:cNvPr id="983442121" name="Picture 983442121"/>
+                          <pic:cNvPicPr/>
+                        </pic:nvPicPr>
+                        <pic:blipFill>
+                          <a:blip r:embed="rId20">
+                            <a:extLst>
+                              <a:ext uri="{28A0092B-C50C-407E-A947-70E740481C1C}">
+                                <a14:useLocalDpi xmlns:a14="http://schemas.microsoft.com/office/drawing/2010/main" val="0"/>
+                              </a:ext>
+                            </a:extLst>
+                          </a:blip>
+                          <a:stretch>
+                            <a:fillRect/>
+                          </a:stretch>
+                        </pic:blipFill>
+                        <pic:spPr>
+                          <a:xfrm>
+                            <a:off x="0" y="0"/>
+                            <a:ext cx="5943600" cy="7955915"/>
+                          </a:xfrm>
+                          <a:prstGeom prst="rect">
+                            <a:avLst/>
+                          </a:prstGeom>
+                        </pic:spPr>
+                      </pic:pic>
+                    </a:graphicData>
+                  </a:graphic>
+                </wp:inline>
+              </w:drawing>
+            </w:r>
+          </w:p>
+          <w:p>
+            <w:pPr>
+              <w:ind w:left="115" w:right="6520"/>
+            </w:pPr>
+            <w:r>
+              <w:rPr>
+                <w:noProof/>
+              </w:rPr>
+              <w:lastRenderedPageBreak/>
+              <w:drawing>
+                <wp:inline distT="0" distB="0" distL="0" distR="0" wp14:anchorId="4B6093DA" wp14:editId="7CD8B95A">
+                  <wp:extent cx="5943600" cy="7754620"/>
+                  <wp:effectExtent l="0" t="0" r="0" b="0"/>
+                  <wp:docPr id="149003074" name="Picture 17"/>
+                  <wp:cNvGraphicFramePr>
+                    <a:graphicFrameLocks xmlns:a="http://schemas.openxmlformats.org/drawingml/2006/main" noChangeAspect="1"/>
+                  </wp:cNvGraphicFramePr>
+                  <a:graphic xmlns:a="http://schemas.openxmlformats.org/drawingml/2006/main">
+                    <a:graphicData uri="http://schemas.openxmlformats.org/drawingml/2006/picture">
+                      <pic:pic xmlns:pic="http://schemas.openxmlformats.org/drawingml/2006/picture">
+                        <pic:nvPicPr>
+                          <pic:cNvPr id="149003074" name="Picture 149003074"/>
+                          <pic:cNvPicPr/>
+                        </pic:nvPicPr>
+                        <pic:blipFill>
+                          <a:blip r:embed="rId21">
+                            <a:extLst>
+                              <a:ext uri="{28A0092B-C50C-407E-A947-70E740481C1C}">
+                                <a14:useLocalDpi xmlns:a14="http://schemas.microsoft.com/office/drawing/2010/main" val="0"/>
+                              </a:ext>
+                            </a:extLst>
+                          </a:blip>
+                          <a:stretch>
+                            <a:fillRect/>
+                          </a:stretch>
+                        </pic:blipFill>
+                        <pic:spPr>
+                          <a:xfrm>
+                            <a:off x="0" y="0"/>
+                            <a:ext cx="5943600" cy="7754620"/>
+                          </a:xfrm>
+                          <a:prstGeom prst="rect">
+                            <a:avLst/>
+                          </a:prstGeom>
+                        </pic:spPr>
+                      </pic:pic>
+                    </a:graphicData>
+                  </a:graphic>
+                </wp:inline>
+              </w:drawing>
+            </w:r>
+          </w:p>
+          <w:p>
+            <w:pPr>
+              <w:ind w:left="115" w:right="6520"/>
+            </w:pPr>
+            <w:r>
+              <w:rPr>
+                <w:noProof/>
+              </w:rPr>
+              <w:lastRenderedPageBreak/>
+              <w:drawing>
+                <wp:inline distT="0" distB="0" distL="0" distR="0" wp14:anchorId="7CC2E7D9" wp14:editId="67D4EACB">
+                  <wp:extent cx="5943600" cy="7806690"/>
+                  <wp:effectExtent l="0" t="0" r="0" b="3810"/>
+                  <wp:docPr id="905790993" name="Picture 18"/>
+                  <wp:cNvGraphicFramePr>
+                    <a:graphicFrameLocks xmlns:a="http://schemas.openxmlformats.org/drawingml/2006/main" noChangeAspect="1"/>
+                  </wp:cNvGraphicFramePr>
+                  <a:graphic xmlns:a="http://schemas.openxmlformats.org/drawingml/2006/main">
+                    <a:graphicData uri="http://schemas.openxmlformats.org/drawingml/2006/picture">
+                      <pic:pic xmlns:pic="http://schemas.openxmlformats.org/drawingml/2006/picture">
+                        <pic:nvPicPr>
+                          <pic:cNvPr id="905790993" name="Picture 905790993"/>
+                          <pic:cNvPicPr/>
+                        </pic:nvPicPr>
+                        <pic:blipFill>
+                          <a:blip r:embed="rId22">
+                            <a:extLst>
+                              <a:ext uri="{28A0092B-C50C-407E-A947-70E740481C1C}">
+                                <a14:useLocalDpi xmlns:a14="http://schemas.microsoft.com/office/drawing/2010/main" val="0"/>
+                              </a:ext>
+                            </a:extLst>
+                          </a:blip>
+                          <a:stretch>
+                            <a:fillRect/>
+                          </a:stretch>
+                        </pic:blipFill>
+                        <pic:spPr>
+                          <a:xfrm>
+                            <a:off x="0" y="0"/>
+                            <a:ext cx="5943600" cy="7806690"/>
+                          </a:xfrm>
+                          <a:prstGeom prst="rect">
+                            <a:avLst/>
+                          </a:prstGeom>
+                        </pic:spPr>
+                      </pic:pic>
+                    </a:graphicData>
+                  </a:graphic>
+                </wp:inline>
+              </w:drawing>
+            </w:r>
+          </w:p>
+          <w:p>
+            <w:pPr>
+              <w:ind w:left="115" w:right="6520"/>
+            </w:pPr>
+            <w:r>
+              <w:rPr>
+                <w:noProof/>
+              </w:rPr>
+              <w:lastRenderedPageBreak/>
+              <w:drawing>
+                <wp:inline distT="0" distB="0" distL="0" distR="0" wp14:anchorId="77BAE1C5" wp14:editId="45F61227">
+                  <wp:extent cx="5943600" cy="7725410"/>
+                  <wp:effectExtent l="0" t="0" r="0" b="8890"/>
+                  <wp:docPr id="1766420459" name="Picture 19"/>
+                  <wp:cNvGraphicFramePr>
+                    <a:graphicFrameLocks xmlns:a="http://schemas.openxmlformats.org/drawingml/2006/main" noChangeAspect="1"/>
+                  </wp:cNvGraphicFramePr>
+                  <a:graphic xmlns:a="http://schemas.openxmlformats.org/drawingml/2006/main">
+                    <a:graphicData uri="http://schemas.openxmlformats.org/drawingml/2006/picture">
+                      <pic:pic xmlns:pic="http://schemas.openxmlformats.org/drawingml/2006/picture">
+                        <pic:nvPicPr>
+                          <pic:cNvPr id="1766420459" name="Picture 1766420459"/>
+                          <pic:cNvPicPr/>
+                        </pic:nvPicPr>
+                        <pic:blipFill>
+                          <a:blip r:embed="rId23">
+                            <a:extLst>
+                              <a:ext uri="{28A0092B-C50C-407E-A947-70E740481C1C}">
+                                <a14:useLocalDpi xmlns:a14="http://schemas.microsoft.com/office/drawing/2010/main" val="0"/>
+                              </a:ext>
+                            </a:extLst>
+                          </a:blip>
+                          <a:stretch>
+                            <a:fillRect/>
+                          </a:stretch>
+                        </pic:blipFill>
+                        <pic:spPr>
+                          <a:xfrm>
+                            <a:off x="0" y="0"/>
+                            <a:ext cx="5943600" cy="7725410"/>
+                          </a:xfrm>
+                          <a:prstGeom prst="rect">
+                            <a:avLst/>
+                          </a:prstGeom>
+                        </pic:spPr>
+                      </pic:pic>
+                    </a:graphicData>
+                  </a:graphic>
+                </wp:inline>
+              </w:drawing>
+            </w:r>
+          </w:p>
+          <w:p>
+            <w:pPr>
+              <w:ind w:left="115" w:right="6520"/>
+            </w:pPr>
+            <w:r>
+              <w:rPr>
+                <w:noProof/>
+              </w:rPr>
+              <w:lastRenderedPageBreak/>
+              <w:drawing>
+                <wp:inline distT="0" distB="0" distL="0" distR="0" wp14:anchorId="3DF4E083" wp14:editId="42C5F3F2">
+                  <wp:extent cx="4991797" cy="8202170"/>
+                  <wp:effectExtent l="0" t="0" r="0" b="8890"/>
+                  <wp:docPr id="184043851" name="Picture 20"/>
+                  <wp:cNvGraphicFramePr>
+                    <a:graphicFrameLocks xmlns:a="http://schemas.openxmlformats.org/drawingml/2006/main" noChangeAspect="1"/>
+                  </wp:cNvGraphicFramePr>
+                  <a:graphic xmlns:a="http://schemas.openxmlformats.org/drawingml/2006/main">
+                    <a:graphicData uri="http://schemas.openxmlformats.org/drawingml/2006/picture">
+                      <pic:pic xmlns:pic="http://schemas.openxmlformats.org/drawingml/2006/picture">
+                        <pic:nvPicPr>
+                          <pic:cNvPr id="184043851" name="Picture 184043851"/>
+                          <pic:cNvPicPr/>
+                        </pic:nvPicPr>
+                        <pic:blipFill>
+                          <a:blip r:embed="rId24">
+                            <a:extLst>
+                              <a:ext uri="{28A0092B-C50C-407E-A947-70E740481C1C}">
+                                <a14:useLocalDpi xmlns:a14="http://schemas.microsoft.com/office/drawing/2010/main" val="0"/>
+                              </a:ext>
+                            </a:extLst>
+                          </a:blip>
+                          <a:stretch>
+                            <a:fillRect/>
+                          </a:stretch>
+                        </pic:blipFill>
+                        <pic:spPr>
+                          <a:xfrm>
+                            <a:off x="0" y="0"/>
+                            <a:ext cx="4991797" cy="8202170"/>
+                          </a:xfrm>
+                          <a:prstGeom prst="rect">
+                            <a:avLst/>
+                          </a:prstGeom>
+                        </pic:spPr>
+                      </pic:pic>
+                    </a:graphicData>
+                  </a:graphic>
+                </wp:inline>
+              </w:drawing>
+            </w:r>
+          </w:p>
+          <w:p>
+            <w:pPr>
+              <w:ind w:left="115" w:right="6520"/>
+            </w:pPr>
+            <w:r>
+              <w:rPr>
+                <w:noProof/>
+              </w:rPr>
+              <w:lastRenderedPageBreak/>
+              <w:drawing>
+                <wp:inline distT="0" distB="0" distL="0" distR="0" wp14:anchorId="3580542D" wp14:editId="5740CBBE">
+                  <wp:extent cx="5943600" cy="7783195"/>
+                  <wp:effectExtent l="0" t="0" r="0" b="8255"/>
+                  <wp:docPr id="1572161713" name="Picture 21"/>
+                  <wp:cNvGraphicFramePr>
+                    <a:graphicFrameLocks xmlns:a="http://schemas.openxmlformats.org/drawingml/2006/main" noChangeAspect="1"/>
+                  </wp:cNvGraphicFramePr>
+                  <a:graphic xmlns:a="http://schemas.openxmlformats.org/drawingml/2006/main">
+                    <a:graphicData uri="http://schemas.openxmlformats.org/drawingml/2006/picture">
+                      <pic:pic xmlns:pic="http://schemas.openxmlformats.org/drawingml/2006/picture">
+                        <pic:nvPicPr>
+                          <pic:cNvPr id="1572161713" name="Picture 1572161713"/>
+                          <pic:cNvPicPr/>
+                        </pic:nvPicPr>
+                        <pic:blipFill>
+                          <a:blip r:embed="rId25">
+                            <a:extLst>
+                              <a:ext uri="{28A0092B-C50C-407E-A947-70E740481C1C}">
+                                <a14:useLocalDpi xmlns:a14="http://schemas.microsoft.com/office/drawing/2010/main" val="0"/>
+                              </a:ext>
+                            </a:extLst>
+                          </a:blip>
+                          <a:stretch>
+                            <a:fillRect/>
+                          </a:stretch>
+                        </pic:blipFill>
+                        <pic:spPr>
+                          <a:xfrm>
+                            <a:off x="0" y="0"/>
+                            <a:ext cx="5943600" cy="7783195"/>
+                          </a:xfrm>
+                          <a:prstGeom prst="rect">
+                            <a:avLst/>
+                          </a:prstGeom>
+                        </pic:spPr>
+                      </pic:pic>
+                    </a:graphicData>
+                  </a:graphic>
+                </wp:inline>
+              </w:drawing>
+            </w:r>
+          </w:p>
+          <w:p>
+            <w:pPr>
+              <w:ind w:left="115" w:right="6520"/>
+            </w:pPr>
+            <w:r>
+              <w:rPr>
+                <w:noProof/>
+              </w:rPr>
+              <w:lastRenderedPageBreak/>
+              <w:drawing>
+                <wp:inline distT="0" distB="0" distL="0" distR="0" wp14:anchorId="207A6731" wp14:editId="5373BA2D">
+                  <wp:extent cx="5943600" cy="7839710"/>
+                  <wp:effectExtent l="0" t="0" r="0" b="8890"/>
+                  <wp:docPr id="1331582079" name="Picture 22"/>
+                  <wp:cNvGraphicFramePr>
+                    <a:graphicFrameLocks xmlns:a="http://schemas.openxmlformats.org/drawingml/2006/main" noChangeAspect="1"/>
+                  </wp:cNvGraphicFramePr>
+                  <a:graphic xmlns:a="http://schemas.openxmlformats.org/drawingml/2006/main">
+                    <a:graphicData uri="http://schemas.openxmlformats.org/drawingml/2006/picture">
+                      <pic:pic xmlns:pic="http://schemas.openxmlformats.org/drawingml/2006/picture">
+                        <pic:nvPicPr>
+                          <pic:cNvPr id="1331582079" name="Picture 1331582079"/>
+                          <pic:cNvPicPr/>
+                        </pic:nvPicPr>
+                        <pic:blipFill>
+                          <a:blip r:embed="rId26">
+                            <a:extLst>
+                              <a:ext uri="{28A0092B-C50C-407E-A947-70E740481C1C}">
+                                <a14:useLocalDpi xmlns:a14="http://schemas.microsoft.com/office/drawing/2010/main" val="0"/>
+                              </a:ext>
+                            </a:extLst>
+                          </a:blip>
+                          <a:stretch>
+                            <a:fillRect/>
+                          </a:stretch>
+                        </pic:blipFill>
+                        <pic:spPr>
+                          <a:xfrm>
+                            <a:off x="0" y="0"/>
+                            <a:ext cx="5943600" cy="7839710"/>
+                          </a:xfrm>
+                          <a:prstGeom prst="rect">
+                            <a:avLst/>
+                          </a:prstGeom>
+                        </pic:spPr>
+                      </pic:pic>
+                    </a:graphicData>
+                  </a:graphic>
+                </wp:inline>
+              </w:drawing>
+            </w:r>
+          </w:p>
+          <w:p>
+            <w:pPr>
+              <w:ind w:left="115" w:right="6520"/>
+            </w:pPr>
+            <w:r>
+              <w:rPr>
+                <w:noProof/>
+              </w:rPr>
+              <w:lastRenderedPageBreak/>
+              <w:drawing>
+                <wp:inline distT="0" distB="0" distL="0" distR="0" wp14:anchorId="05CF0C26" wp14:editId="3C3FD71D">
+                  <wp:extent cx="5943600" cy="7873365"/>
+                  <wp:effectExtent l="0" t="0" r="0" b="0"/>
+                  <wp:docPr id="1830965940" name="Picture 23"/>
+                  <wp:cNvGraphicFramePr>
+                    <a:graphicFrameLocks xmlns:a="http://schemas.openxmlformats.org/drawingml/2006/main" noChangeAspect="1"/>
+                  </wp:cNvGraphicFramePr>
+                  <a:graphic xmlns:a="http://schemas.openxmlformats.org/drawingml/2006/main">
+                    <a:graphicData uri="http://schemas.openxmlformats.org/drawingml/2006/picture">
+                      <pic:pic xmlns:pic="http://schemas.openxmlformats.org/drawingml/2006/picture">
+                        <pic:nvPicPr>
+                          <pic:cNvPr id="1830965940" name="Picture 1830965940"/>
+                          <pic:cNvPicPr/>
+                        </pic:nvPicPr>
+                        <pic:blipFill>
+                          <a:blip r:embed="rId27">
+                            <a:extLst>
+                              <a:ext uri="{28A0092B-C50C-407E-A947-70E740481C1C}">
+                                <a14:useLocalDpi xmlns:a14="http://schemas.microsoft.com/office/drawing/2010/main" val="0"/>
+                              </a:ext>
+                            </a:extLst>
+                          </a:blip>
+                          <a:stretch>
+                            <a:fillRect/>
+                          </a:stretch>
+                        </pic:blipFill>
+                        <pic:spPr>
+                          <a:xfrm>
+                            <a:off x="0" y="0"/>
+                            <a:ext cx="5943600" cy="7873365"/>
+                          </a:xfrm>
+                          <a:prstGeom prst="rect">
+                            <a:avLst/>
+                          </a:prstGeom>
+                        </pic:spPr>
+                      </pic:pic>
+                    </a:graphicData>
+                  </a:graphic>
+                </wp:inline>
+              </w:drawing>
+            </w:r>
+          </w:p>
+          <w:p>
+            <w:pPr>
+              <w:ind w:left="115" w:right="6520"/>
+            </w:pPr>
+            <w:r>
+              <w:rPr>
+                <w:noProof/>
+              </w:rPr>
+              <w:lastRenderedPageBreak/>
+              <w:drawing>
+                <wp:inline distT="0" distB="0" distL="0" distR="0" wp14:anchorId="760A1A06" wp14:editId="4EB75A5D">
+                  <wp:extent cx="5943600" cy="7822565"/>
+                  <wp:effectExtent l="0" t="0" r="0" b="6985"/>
+                  <wp:docPr id="1796231514" name="Picture 24"/>
+                  <wp:cNvGraphicFramePr>
+                    <a:graphicFrameLocks xmlns:a="http://schemas.openxmlformats.org/drawingml/2006/main" noChangeAspect="1"/>
+                  </wp:cNvGraphicFramePr>
+                  <a:graphic xmlns:a="http://schemas.openxmlformats.org/drawingml/2006/main">
+                    <a:graphicData uri="http://schemas.openxmlformats.org/drawingml/2006/picture">
+                      <pic:pic xmlns:pic="http://schemas.openxmlformats.org/drawingml/2006/picture">
+                        <pic:nvPicPr>
+                          <pic:cNvPr id="1796231514" name="Picture 1796231514"/>
+                          <pic:cNvPicPr/>
+                        </pic:nvPicPr>
+                        <pic:blipFill>
+                          <a:blip r:embed="rId28">
+                            <a:extLst>
+                              <a:ext uri="{28A0092B-C50C-407E-A947-70E740481C1C}">
+                                <a14:useLocalDpi xmlns:a14="http://schemas.microsoft.com/office/drawing/2010/main" val="0"/>
+                              </a:ext>
+                            </a:extLst>
+                          </a:blip>
+                          <a:stretch>
+                            <a:fillRect/>
+                          </a:stretch>
+                        </pic:blipFill>
+                        <pic:spPr>
+                          <a:xfrm>
+                            <a:off x="0" y="0"/>
+                            <a:ext cx="5943600" cy="7822565"/>
+                          </a:xfrm>
+                          <a:prstGeom prst="rect">
+                            <a:avLst/>
+                          </a:prstGeom>
+                        </pic:spPr>
+                      </pic:pic>
+                    </a:graphicData>
+                  </a:graphic>
+                </wp:inline>
+              </w:drawing>
+            </w:r>
+          </w:p>
+          <w:p>
+            <w:pPr>
+              <w:ind w:left="115" w:right="6520"/>
+            </w:pPr>
+            <w:r>
+              <w:rPr>
+                <w:noProof/>
+              </w:rPr>
+              <w:lastRenderedPageBreak/>
+              <w:drawing>
+                <wp:inline distT="0" distB="0" distL="0" distR="0" wp14:anchorId="01529CD2" wp14:editId="370A6ADD">
+                  <wp:extent cx="5943600" cy="7538085"/>
+                  <wp:effectExtent l="0" t="0" r="0" b="5715"/>
+                  <wp:docPr id="1352942834" name="Picture 25"/>
+                  <wp:cNvGraphicFramePr>
+                    <a:graphicFrameLocks xmlns:a="http://schemas.openxmlformats.org/drawingml/2006/main" noChangeAspect="1"/>
+                  </wp:cNvGraphicFramePr>
+                  <a:graphic xmlns:a="http://schemas.openxmlformats.org/drawingml/2006/main">
+                    <a:graphicData uri="http://schemas.openxmlformats.org/drawingml/2006/picture">
+                      <pic:pic xmlns:pic="http://schemas.openxmlformats.org/drawingml/2006/picture">
+                        <pic:nvPicPr>
+                          <pic:cNvPr id="1352942834" name="Picture 1352942834"/>
+                          <pic:cNvPicPr/>
+                        </pic:nvPicPr>
+                        <pic:blipFill>
+                          <a:blip r:embed="rId29">
+                            <a:extLst>
+                              <a:ext uri="{28A0092B-C50C-407E-A947-70E740481C1C}">
+                                <a14:useLocalDpi xmlns:a14="http://schemas.microsoft.com/office/drawing/2010/main" val="0"/>
+                              </a:ext>
+                            </a:extLst>
+                          </a:blip>
+                          <a:stretch>
+                            <a:fillRect/>
+                          </a:stretch>
+                        </pic:blipFill>
+                        <pic:spPr>
+                          <a:xfrm>
+                            <a:off x="0" y="0"/>
+                            <a:ext cx="5943600" cy="7538085"/>
+                          </a:xfrm>
+                          <a:prstGeom prst="rect">
+                            <a:avLst/>
+                          </a:prstGeom>
+                        </pic:spPr>
+                      </pic:pic>
+                    </a:graphicData>
+                  </a:graphic>
+                </wp:inline>
+              </w:drawing>
+            </w:r>
+          </w:p>
+          <w:p>
+            <w:pPr>
+              <w:ind w:left="115" w:right="6520"/>
+            </w:pPr>
+            <w:r>
+              <w:rPr>
+                <w:noProof/>
+              </w:rPr>
+              <w:lastRenderedPageBreak/>
+              <w:drawing>
+                <wp:inline distT="0" distB="0" distL="0" distR="0" wp14:anchorId="2BC1E312" wp14:editId="0AAC73F9">
+                  <wp:extent cx="5943600" cy="7869555"/>
+                  <wp:effectExtent l="0" t="0" r="0" b="0"/>
+                  <wp:docPr id="1960491047" name="Picture 26"/>
+                  <wp:cNvGraphicFramePr>
+                    <a:graphicFrameLocks xmlns:a="http://schemas.openxmlformats.org/drawingml/2006/main" noChangeAspect="1"/>
+                  </wp:cNvGraphicFramePr>
+                  <a:graphic xmlns:a="http://schemas.openxmlformats.org/drawingml/2006/main">
+                    <a:graphicData uri="http://schemas.openxmlformats.org/drawingml/2006/picture">
+                      <pic:pic xmlns:pic="http://schemas.openxmlformats.org/drawingml/2006/picture">
+                        <pic:nvPicPr>
+                          <pic:cNvPr id="1960491047" name="Picture 1960491047"/>
+                          <pic:cNvPicPr/>
+                        </pic:nvPicPr>
+                        <pic:blipFill>
+                          <a:blip r:embed="rId30">
+                            <a:extLst>
+                              <a:ext uri="{28A0092B-C50C-407E-A947-70E740481C1C}">
+                                <a14:useLocalDpi xmlns:a14="http://schemas.microsoft.com/office/drawing/2010/main" val="0"/>
+                              </a:ext>
+                            </a:extLst>
+                          </a:blip>
+                          <a:stretch>
+                            <a:fillRect/>
+                          </a:stretch>
+                        </pic:blipFill>
+                        <pic:spPr>
+                          <a:xfrm>
+                            <a:off x="0" y="0"/>
+                            <a:ext cx="5943600" cy="7869555"/>
+                          </a:xfrm>
+                          <a:prstGeom prst="rect">
+                            <a:avLst/>
+                          </a:prstGeom>
+                        </pic:spPr>
+                      </pic:pic>
+                    </a:graphicData>
+                  </a:graphic>
+                </wp:inline>
+              </w:drawing>
+            </w:r>
+          </w:p>
+          <w:p>
+            <w:pPr>
+              <w:ind w:left="115" w:right="6520"/>
+            </w:pPr>
           </w:p>
         </w:tc>
         <w:tc>
@@ -782,6 +2150,7 @@
                 <w:color w:val="1D2125"/>
                 <w:sz w:val="24"/>
               </w:rPr>
+              <w:lastRenderedPageBreak/>
               <w:t xml:space="preserve">Member 2 name here </w:t>
             </w:r>
           </w:p>
@@ -831,6 +2200,7 @@
                 <w:color w:val="1D2125"/>
                 <w:sz w:val="24"/>
               </w:rPr>
+              <w:lastRenderedPageBreak/>
               <w:t>Prototype link here</w:t>
             </w:r>
             <w:r>
@@ -1123,7 +2493,6 @@
                 <w:color w:val="1D2125"/>
                 <w:sz w:val="24"/>
               </w:rPr>
-              <w:lastRenderedPageBreak/>
               <w:t xml:space="preserve">Insert the summary here.  The summary must include what features (and why) were taken from each member’s design to build the final prototype.  It should also include how this prototype is UI/UX compliant.  </w:t>
             </w:r>
           </w:p>
@@ -1164,7 +2533,6 @@
         <w:tblCellMar>
           <w:top w:w="50" w:type="dxa"/>
           <w:left w:w="30" w:type="dxa"/>
-          <w:bottom w:w="0" w:type="dxa"/>
           <w:right w:w="115" w:type="dxa"/>
         </w:tblCellMar>
         <w:tblLook w:val="04A0" w:firstRow="1" w:lastRow="0" w:firstColumn="1" w:lastColumn="0" w:noHBand="0" w:noVBand="1"/>
@@ -1669,6 +3037,41 @@
       </w:tblCellMar>
     </w:tblPr>
   </w:style>
+  <w:style w:type="character" w:styleId="Hyperlink">
+    <w:name w:val="Hyperlink"/>
+    <w:basedOn w:val="DefaultParagraphFont"/>
+    <w:uiPriority w:val="99"/>
+    <w:unhideWhenUsed/>
+    <w:rsid w:val="00F22863"/>
+    <w:rPr>
+      <w:color w:val="467886" w:themeColor="hyperlink"/>
+      <w:u w:val="single"/>
+    </w:rPr>
+  </w:style>
+  <w:style w:type="character" w:styleId="UnresolvedMention">
+    <w:name w:val="Unresolved Mention"/>
+    <w:basedOn w:val="DefaultParagraphFont"/>
+    <w:uiPriority w:val="99"/>
+    <w:semiHidden/>
+    <w:unhideWhenUsed/>
+    <w:rsid w:val="00F22863"/>
+    <w:rPr>
+      <w:color w:val="605E5C"/>
+      <w:shd w:val="clear" w:color="auto" w:fill="E1DFDD"/>
+    </w:rPr>
+  </w:style>
+  <w:style w:type="character" w:styleId="FollowedHyperlink">
+    <w:name w:val="FollowedHyperlink"/>
+    <w:basedOn w:val="DefaultParagraphFont"/>
+    <w:uiPriority w:val="99"/>
+    <w:semiHidden/>
+    <w:unhideWhenUsed/>
+    <w:rsid w:val="00F22863"/>
+    <w:rPr>
+      <w:color w:val="96607D" w:themeColor="followedHyperlink"/>
+      <w:u w:val="single"/>
+    </w:rPr>
+  </w:style>
 </w:styles>
 </file>
 

</xml_diff>

<commit_message>
Added prototype link and screenshots
</commit_message>
<xml_diff>
--- a/documents/prototypes.docx
+++ b/documents/prototypes.docx
@@ -135,7 +135,6 @@
               </w:rPr>
               <w:t xml:space="preserve">Project Name:  </w:t>
             </w:r>
-            <w:proofErr w:type="spellStart"/>
             <w:r>
               <w:rPr>
                 <w:rFonts w:ascii="Calibri" w:eastAsia="Calibri" w:hAnsi="Calibri" w:cs="Calibri"/>
@@ -146,7 +145,6 @@
               </w:rPr>
               <w:t>YourAverageGamer</w:t>
             </w:r>
-            <w:proofErr w:type="spellEnd"/>
           </w:p>
           <w:p>
             <w:pPr>
@@ -200,23 +198,13 @@
             <w:pPr>
               <w:ind w:left="0"/>
             </w:pPr>
-            <w:proofErr w:type="spellStart"/>
             <w:r>
               <w:rPr>
                 <w:rFonts w:ascii="Calibri" w:eastAsia="Calibri" w:hAnsi="Calibri" w:cs="Calibri"/>
                 <w:color w:val="1D2125"/>
                 <w:sz w:val="24"/>
               </w:rPr>
-              <w:t>Github</w:t>
-            </w:r>
-            <w:proofErr w:type="spellEnd"/>
-            <w:r>
-              <w:rPr>
-                <w:rFonts w:ascii="Calibri" w:eastAsia="Calibri" w:hAnsi="Calibri" w:cs="Calibri"/>
-                <w:color w:val="1D2125"/>
-                <w:sz w:val="24"/>
-              </w:rPr>
-              <w:t xml:space="preserve"> repo URL:  </w:t>
+              <w:t xml:space="preserve">Github repo URL:  </w:t>
             </w:r>
             <w:r>
               <w:rPr>
@@ -678,15 +666,7 @@
                 <w:color w:val="1D2125"/>
                 <w:sz w:val="24"/>
               </w:rPr>
-              <w:t>Jermaine Jackson</w:t>
-            </w:r>
-            <w:r>
-              <w:rPr>
-                <w:rFonts w:ascii="Calibri" w:eastAsia="Calibri" w:hAnsi="Calibri" w:cs="Calibri"/>
-                <w:color w:val="1D2125"/>
-                <w:sz w:val="24"/>
-              </w:rPr>
-              <w:t xml:space="preserve"> </w:t>
+              <w:t xml:space="preserve">Jermaine Jackson </w:t>
             </w:r>
           </w:p>
         </w:tc>
@@ -732,19 +712,7 @@
                 <w:rPr>
                   <w:rStyle w:val="Hyperlink"/>
                 </w:rPr>
-                <w:t>https://www.figma.com/p</w:t>
-              </w:r>
-              <w:r>
-                <w:rPr>
-                  <w:rStyle w:val="Hyperlink"/>
-                </w:rPr>
-                <w:t>r</w:t>
-              </w:r>
-              <w:r>
-                <w:rPr>
-                  <w:rStyle w:val="Hyperlink"/>
-                </w:rPr>
-                <w:t>oto/e7a0u8bAjf2bvAFFxIlIWE/P1A5?node-id=1-3094&amp;t=OrDuZe0z94Jdm56x-1</w:t>
+                <w:t>https://www.figma.com/proto/e7a0u8bAjf2bvAFFxIlIWE/P1A5?node-id=1-3094&amp;t=OrDuZe0z94Jdm56x-1</w:t>
               </w:r>
             </w:hyperlink>
           </w:p>
@@ -2151,7 +2119,15 @@
                 <w:sz w:val="24"/>
               </w:rPr>
               <w:lastRenderedPageBreak/>
-              <w:t xml:space="preserve">Member 2 name here </w:t>
+              <w:t>Robert Hicks Jr</w:t>
+            </w:r>
+            <w:r>
+              <w:rPr>
+                <w:rFonts w:ascii="Calibri" w:eastAsia="Calibri" w:hAnsi="Calibri" w:cs="Calibri"/>
+                <w:color w:val="1D2125"/>
+                <w:sz w:val="24"/>
+              </w:rPr>
+              <w:t xml:space="preserve"> </w:t>
             </w:r>
           </w:p>
         </w:tc>
@@ -2192,52 +2168,156 @@
             <w:pPr>
               <w:ind w:left="115"/>
             </w:pPr>
-            <w:r>
-              <w:rPr>
-                <w:rFonts w:ascii="Calibri" w:eastAsia="Calibri" w:hAnsi="Calibri" w:cs="Calibri"/>
-                <w:b w:val="0"/>
-                <w:i/>
-                <w:color w:val="1D2125"/>
-                <w:sz w:val="24"/>
-              </w:rPr>
+            <w:hyperlink r:id="rId31" w:history="1">
+              <w:r>
+                <w:rPr>
+                  <w:rStyle w:val="Hyperlink"/>
+                </w:rPr>
+                <w:t>https://www.figma.com/design/zuvUxFpZFo8JdwIpoqElOH/YourAverageGamer-Prototype?node-id=0-1&amp;p=f&amp;t=1AeRbI1rW11BlYuT-0</w:t>
+              </w:r>
+            </w:hyperlink>
+          </w:p>
+          <w:p>
+            <w:pPr>
+              <w:ind w:left="115"/>
+            </w:pPr>
+          </w:p>
+          <w:p>
+            <w:pPr>
+              <w:ind w:left="115"/>
+            </w:pPr>
+            <w:r>
+              <w:drawing>
+                <wp:inline distT="0" distB="0" distL="0" distR="0" wp14:anchorId="57A6371A" wp14:editId="1E9CBE1C">
+                  <wp:extent cx="5943600" cy="5926455"/>
+                  <wp:effectExtent l="0" t="0" r="0" b="0"/>
+                  <wp:docPr id="232133545" name="Picture 1"/>
+                  <wp:cNvGraphicFramePr>
+                    <a:graphicFrameLocks xmlns:a="http://schemas.openxmlformats.org/drawingml/2006/main" noChangeAspect="1"/>
+                  </wp:cNvGraphicFramePr>
+                  <a:graphic xmlns:a="http://schemas.openxmlformats.org/drawingml/2006/main">
+                    <a:graphicData uri="http://schemas.openxmlformats.org/drawingml/2006/picture">
+                      <pic:pic xmlns:pic="http://schemas.openxmlformats.org/drawingml/2006/picture">
+                        <pic:nvPicPr>
+                          <pic:cNvPr id="232133545" name=""/>
+                          <pic:cNvPicPr/>
+                        </pic:nvPicPr>
+                        <pic:blipFill>
+                          <a:blip r:embed="rId32"/>
+                          <a:stretch>
+                            <a:fillRect/>
+                          </a:stretch>
+                        </pic:blipFill>
+                        <pic:spPr>
+                          <a:xfrm>
+                            <a:off x="0" y="0"/>
+                            <a:ext cx="5943600" cy="5926455"/>
+                          </a:xfrm>
+                          <a:prstGeom prst="rect">
+                            <a:avLst/>
+                          </a:prstGeom>
+                        </pic:spPr>
+                      </pic:pic>
+                    </a:graphicData>
+                  </a:graphic>
+                </wp:inline>
+              </w:drawing>
+            </w:r>
+          </w:p>
+          <w:p>
+            <w:pPr>
+              <w:ind w:left="115"/>
+            </w:pPr>
+          </w:p>
+          <w:p>
+            <w:pPr>
+              <w:ind w:left="115"/>
+            </w:pPr>
+            <w:r>
               <w:lastRenderedPageBreak/>
-              <w:t>Prototype link here</w:t>
-            </w:r>
-            <w:r>
-              <w:rPr>
-                <w:b w:val="0"/>
-              </w:rPr>
-              <w:t xml:space="preserve"> </w:t>
+              <w:drawing>
+                <wp:inline distT="0" distB="0" distL="0" distR="0" wp14:anchorId="1DB7D9F0" wp14:editId="3130844F">
+                  <wp:extent cx="5943600" cy="6495415"/>
+                  <wp:effectExtent l="0" t="0" r="0" b="635"/>
+                  <wp:docPr id="675700696" name="Picture 1"/>
+                  <wp:cNvGraphicFramePr>
+                    <a:graphicFrameLocks xmlns:a="http://schemas.openxmlformats.org/drawingml/2006/main" noChangeAspect="1"/>
+                  </wp:cNvGraphicFramePr>
+                  <a:graphic xmlns:a="http://schemas.openxmlformats.org/drawingml/2006/main">
+                    <a:graphicData uri="http://schemas.openxmlformats.org/drawingml/2006/picture">
+                      <pic:pic xmlns:pic="http://schemas.openxmlformats.org/drawingml/2006/picture">
+                        <pic:nvPicPr>
+                          <pic:cNvPr id="675700696" name=""/>
+                          <pic:cNvPicPr/>
+                        </pic:nvPicPr>
+                        <pic:blipFill>
+                          <a:blip r:embed="rId33"/>
+                          <a:stretch>
+                            <a:fillRect/>
+                          </a:stretch>
+                        </pic:blipFill>
+                        <pic:spPr>
+                          <a:xfrm>
+                            <a:off x="0" y="0"/>
+                            <a:ext cx="5943600" cy="6495415"/>
+                          </a:xfrm>
+                          <a:prstGeom prst="rect">
+                            <a:avLst/>
+                          </a:prstGeom>
+                        </pic:spPr>
+                      </pic:pic>
+                    </a:graphicData>
+                  </a:graphic>
+                </wp:inline>
+              </w:drawing>
             </w:r>
           </w:p>
           <w:p>
             <w:pPr>
               <w:ind w:left="115"/>
             </w:pPr>
-            <w:r>
-              <w:rPr>
-                <w:rFonts w:ascii="Calibri" w:eastAsia="Calibri" w:hAnsi="Calibri" w:cs="Calibri"/>
-                <w:b w:val="0"/>
-                <w:i/>
-                <w:color w:val="1D2125"/>
-                <w:sz w:val="24"/>
-              </w:rPr>
-              <w:t xml:space="preserve">All screenshots here </w:t>
-            </w:r>
           </w:p>
           <w:p>
             <w:pPr>
               <w:ind w:left="115"/>
             </w:pPr>
             <w:r>
-              <w:rPr>
-                <w:rFonts w:ascii="Calibri" w:eastAsia="Calibri" w:hAnsi="Calibri" w:cs="Calibri"/>
-                <w:b w:val="0"/>
-                <w:i/>
-                <w:color w:val="1D2125"/>
-                <w:sz w:val="24"/>
-              </w:rPr>
-              <w:t xml:space="preserve"> </w:t>
+              <w:lastRenderedPageBreak/>
+              <w:drawing>
+                <wp:inline distT="0" distB="0" distL="0" distR="0" wp14:anchorId="6A03D21F" wp14:editId="2FA0E93F">
+                  <wp:extent cx="5943600" cy="6509385"/>
+                  <wp:effectExtent l="0" t="0" r="0" b="5715"/>
+                  <wp:docPr id="535977282" name="Picture 1"/>
+                  <wp:cNvGraphicFramePr>
+                    <a:graphicFrameLocks xmlns:a="http://schemas.openxmlformats.org/drawingml/2006/main" noChangeAspect="1"/>
+                  </wp:cNvGraphicFramePr>
+                  <a:graphic xmlns:a="http://schemas.openxmlformats.org/drawingml/2006/main">
+                    <a:graphicData uri="http://schemas.openxmlformats.org/drawingml/2006/picture">
+                      <pic:pic xmlns:pic="http://schemas.openxmlformats.org/drawingml/2006/picture">
+                        <pic:nvPicPr>
+                          <pic:cNvPr id="535977282" name=""/>
+                          <pic:cNvPicPr/>
+                        </pic:nvPicPr>
+                        <pic:blipFill>
+                          <a:blip r:embed="rId34"/>
+                          <a:stretch>
+                            <a:fillRect/>
+                          </a:stretch>
+                        </pic:blipFill>
+                        <pic:spPr>
+                          <a:xfrm>
+                            <a:off x="0" y="0"/>
+                            <a:ext cx="5943600" cy="6509385"/>
+                          </a:xfrm>
+                          <a:prstGeom prst="rect">
+                            <a:avLst/>
+                          </a:prstGeom>
+                        </pic:spPr>
+                      </pic:pic>
+                    </a:graphicData>
+                  </a:graphic>
+                </wp:inline>
+              </w:drawing>
             </w:r>
           </w:p>
         </w:tc>
@@ -2259,6 +2339,7 @@
               <w:rPr>
                 <w:b w:val="0"/>
               </w:rPr>
+              <w:lastRenderedPageBreak/>
               <w:t xml:space="preserve"> </w:t>
             </w:r>
           </w:p>
@@ -2289,6 +2370,7 @@
                 <w:color w:val="1D2125"/>
                 <w:sz w:val="24"/>
               </w:rPr>
+              <w:lastRenderedPageBreak/>
               <w:t xml:space="preserve">Final prototype </w:t>
             </w:r>
           </w:p>
@@ -2493,6 +2575,7 @@
                 <w:color w:val="1D2125"/>
                 <w:sz w:val="24"/>
               </w:rPr>
+              <w:lastRenderedPageBreak/>
               <w:t xml:space="preserve">Insert the summary here.  The summary must include what features (and why) were taken from each member’s design to build the final prototype.  It should also include how this prototype is UI/UX compliant.  </w:t>
             </w:r>
           </w:p>

</xml_diff>

<commit_message>
Added summary of final prototype
</commit_message>
<xml_diff>
--- a/documents/prototypes.docx
+++ b/documents/prototypes.docx
@@ -133,8 +133,18 @@
                 <w:color w:val="1D2125"/>
                 <w:sz w:val="24"/>
               </w:rPr>
-              <w:t xml:space="preserve">Project Name:  </w:t>
-            </w:r>
+              <w:t>Project Name</w:t>
+            </w:r>
+            <w:proofErr w:type="gramStart"/>
+            <w:r>
+              <w:rPr>
+                <w:rFonts w:ascii="Calibri" w:eastAsia="Calibri" w:hAnsi="Calibri" w:cs="Calibri"/>
+                <w:color w:val="1D2125"/>
+                <w:sz w:val="24"/>
+              </w:rPr>
+              <w:t xml:space="preserve">:  </w:t>
+            </w:r>
+            <w:proofErr w:type="spellStart"/>
             <w:r>
               <w:rPr>
                 <w:rFonts w:ascii="Calibri" w:eastAsia="Calibri" w:hAnsi="Calibri" w:cs="Calibri"/>
@@ -145,6 +155,8 @@
               </w:rPr>
               <w:t>YourAverageGamer</w:t>
             </w:r>
+            <w:proofErr w:type="spellEnd"/>
+            <w:proofErr w:type="gramEnd"/>
           </w:p>
           <w:p>
             <w:pPr>
@@ -198,13 +210,23 @@
             <w:pPr>
               <w:ind w:left="0"/>
             </w:pPr>
+            <w:proofErr w:type="spellStart"/>
             <w:r>
               <w:rPr>
                 <w:rFonts w:ascii="Calibri" w:eastAsia="Calibri" w:hAnsi="Calibri" w:cs="Calibri"/>
                 <w:color w:val="1D2125"/>
                 <w:sz w:val="24"/>
               </w:rPr>
-              <w:t xml:space="preserve">Github repo URL:  </w:t>
+              <w:t>Github</w:t>
+            </w:r>
+            <w:proofErr w:type="spellEnd"/>
+            <w:r>
+              <w:rPr>
+                <w:rFonts w:ascii="Calibri" w:eastAsia="Calibri" w:hAnsi="Calibri" w:cs="Calibri"/>
+                <w:color w:val="1D2125"/>
+                <w:sz w:val="24"/>
+              </w:rPr>
+              <w:t xml:space="preserve"> repo URL:  </w:t>
             </w:r>
             <w:r>
               <w:rPr>
@@ -2119,15 +2141,7 @@
                 <w:sz w:val="24"/>
               </w:rPr>
               <w:lastRenderedPageBreak/>
-              <w:t>Robert Hicks Jr</w:t>
-            </w:r>
-            <w:r>
-              <w:rPr>
-                <w:rFonts w:ascii="Calibri" w:eastAsia="Calibri" w:hAnsi="Calibri" w:cs="Calibri"/>
-                <w:color w:val="1D2125"/>
-                <w:sz w:val="24"/>
-              </w:rPr>
-              <w:t xml:space="preserve"> </w:t>
+              <w:t xml:space="preserve">Robert Hicks Jr </w:t>
             </w:r>
           </w:p>
         </w:tc>
@@ -2187,6 +2201,9 @@
               <w:ind w:left="115"/>
             </w:pPr>
             <w:r>
+              <w:rPr>
+                <w:noProof/>
+              </w:rPr>
               <w:drawing>
                 <wp:inline distT="0" distB="0" distL="0" distR="0" wp14:anchorId="57A6371A" wp14:editId="1E9CBE1C">
                   <wp:extent cx="5943600" cy="5926455"/>
@@ -2234,6 +2251,9 @@
               <w:ind w:left="115"/>
             </w:pPr>
             <w:r>
+              <w:rPr>
+                <w:noProof/>
+              </w:rPr>
               <w:lastRenderedPageBreak/>
               <w:drawing>
                 <wp:inline distT="0" distB="0" distL="0" distR="0" wp14:anchorId="1DB7D9F0" wp14:editId="3130844F">
@@ -2282,6 +2302,9 @@
               <w:ind w:left="115"/>
             </w:pPr>
             <w:r>
+              <w:rPr>
+                <w:noProof/>
+              </w:rPr>
               <w:lastRenderedPageBreak/>
               <w:drawing>
                 <wp:inline distT="0" distB="0" distL="0" distR="0" wp14:anchorId="6A03D21F" wp14:editId="2FA0E93F">
@@ -2564,19 +2587,25 @@
             </w:tcBorders>
           </w:tcPr>
           <w:p>
-            <w:pPr>
-              <w:ind w:left="115"/>
-            </w:pPr>
-            <w:r>
-              <w:rPr>
-                <w:rFonts w:ascii="Calibri" w:eastAsia="Calibri" w:hAnsi="Calibri" w:cs="Calibri"/>
-                <w:b w:val="0"/>
-                <w:i/>
-                <w:color w:val="1D2125"/>
-                <w:sz w:val="24"/>
-              </w:rPr>
+            <w:r>
               <w:lastRenderedPageBreak/>
-              <w:t xml:space="preserve">Insert the summary here.  The summary must include what features (and why) were taken from each member’s design to build the final prototype.  It should also include how this prototype is UI/UX compliant.  </w:t>
+              <w:t xml:space="preserve">To design </w:t>
+            </w:r>
+            <w:proofErr w:type="spellStart"/>
+            <w:r>
+              <w:t>YourAverageGamer</w:t>
+            </w:r>
+            <w:proofErr w:type="spellEnd"/>
+            <w:r>
+              <w:t xml:space="preserve"> webpage, the team decided to take </w:t>
+            </w:r>
+            <w:proofErr w:type="gramStart"/>
+            <w:r>
+              <w:t>an</w:t>
+            </w:r>
+            <w:proofErr w:type="gramEnd"/>
+            <w:r>
+              <w:t xml:space="preserve"> user friendly approach by incorporating stock images of various gaming material to strike an appeal. The multimedia makes up the bulk of the pages with short summaries and attention-grabbers to garner clicks. The various pages are nestled in hyperlinks for easy directory as well. Robert took a user approach, and Jermaine followed up with an excellent nesting design to ensure that the correct information is in the appropriate location. The emphasis was placed on making the site vibrant, simplistic, and organized. We essentially took the best of both worlds to ensure that the site was appealing to our target audience and easy to navigate. </w:t>
             </w:r>
           </w:p>
         </w:tc>

</xml_diff>

<commit_message>
Screenshots and Final link added
</commit_message>
<xml_diff>
--- a/documents/prototypes.docx
+++ b/documents/prototypes.docx
@@ -144,7 +144,6 @@
               </w:rPr>
               <w:t xml:space="preserve">:  </w:t>
             </w:r>
-            <w:proofErr w:type="spellStart"/>
             <w:r>
               <w:rPr>
                 <w:rFonts w:ascii="Calibri" w:eastAsia="Calibri" w:hAnsi="Calibri" w:cs="Calibri"/>
@@ -155,7 +154,6 @@
               </w:rPr>
               <w:t>YourAverageGamer</w:t>
             </w:r>
-            <w:proofErr w:type="spellEnd"/>
             <w:proofErr w:type="gramEnd"/>
           </w:p>
           <w:p>
@@ -210,23 +208,13 @@
             <w:pPr>
               <w:ind w:left="0"/>
             </w:pPr>
-            <w:proofErr w:type="spellStart"/>
             <w:r>
               <w:rPr>
                 <w:rFonts w:ascii="Calibri" w:eastAsia="Calibri" w:hAnsi="Calibri" w:cs="Calibri"/>
                 <w:color w:val="1D2125"/>
                 <w:sz w:val="24"/>
               </w:rPr>
-              <w:t>Github</w:t>
-            </w:r>
-            <w:proofErr w:type="spellEnd"/>
-            <w:r>
-              <w:rPr>
-                <w:rFonts w:ascii="Calibri" w:eastAsia="Calibri" w:hAnsi="Calibri" w:cs="Calibri"/>
-                <w:color w:val="1D2125"/>
-                <w:sz w:val="24"/>
-              </w:rPr>
-              <w:t xml:space="preserve"> repo URL:  </w:t>
+              <w:t xml:space="preserve">Github repo URL:  </w:t>
             </w:r>
             <w:r>
               <w:rPr>
@@ -2438,8 +2426,45 @@
           <w:p>
             <w:pPr>
               <w:ind w:left="115"/>
-            </w:pPr>
-            <w:r>
+              <w:rPr>
+                <w:b w:val="0"/>
+              </w:rPr>
+            </w:pPr>
+            <w:hyperlink r:id="rId35" w:history="1">
+              <w:r>
+                <w:rPr>
+                  <w:rStyle w:val="Hyperlink"/>
+                  <w:rFonts w:ascii="Calibri" w:eastAsia="Calibri" w:hAnsi="Calibri" w:cs="Calibri"/>
+                  <w:b w:val="0"/>
+                  <w:i/>
+                  <w:sz w:val="24"/>
+                </w:rPr>
+                <w:t>Prototype link here</w:t>
+              </w:r>
+            </w:hyperlink>
+            <w:r>
+              <w:rPr>
+                <w:b w:val="0"/>
+              </w:rPr>
+              <w:t xml:space="preserve"> </w:t>
+            </w:r>
+          </w:p>
+          <w:p>
+            <w:pPr>
+              <w:ind w:left="115"/>
+            </w:pPr>
+            <w:hyperlink r:id="rId36" w:history="1">
+              <w:r>
+                <w:rPr>
+                  <w:rStyle w:val="Hyperlink"/>
+                </w:rPr>
+                <w:t>Untitled – Figma</w:t>
+              </w:r>
+            </w:hyperlink>
+          </w:p>
+          <w:p>
+            <w:pPr>
+              <w:ind w:left="115"/>
               <w:rPr>
                 <w:rFonts w:ascii="Calibri" w:eastAsia="Calibri" w:hAnsi="Calibri" w:cs="Calibri"/>
                 <w:b w:val="0"/>
@@ -2447,18 +2472,6 @@
                 <w:color w:val="1D2125"/>
                 <w:sz w:val="24"/>
               </w:rPr>
-              <w:t>Prototype link here</w:t>
-            </w:r>
-            <w:r>
-              <w:rPr>
-                <w:b w:val="0"/>
-              </w:rPr>
-              <w:t xml:space="preserve"> </w:t>
-            </w:r>
-          </w:p>
-          <w:p>
-            <w:pPr>
-              <w:ind w:left="115"/>
             </w:pPr>
             <w:r>
               <w:rPr>
@@ -2468,14 +2481,47 @@
                 <w:color w:val="1D2125"/>
                 <w:sz w:val="24"/>
               </w:rPr>
-              <w:t xml:space="preserve">All screenshots here </w:t>
+              <w:lastRenderedPageBreak/>
+              <w:drawing>
+                <wp:inline distT="0" distB="0" distL="0" distR="0" wp14:anchorId="312B3B41" wp14:editId="628D0956">
+                  <wp:extent cx="5943600" cy="5055235"/>
+                  <wp:effectExtent l="0" t="0" r="0" b="0"/>
+                  <wp:docPr id="1672155259" name="Picture 1"/>
+                  <wp:cNvGraphicFramePr>
+                    <a:graphicFrameLocks xmlns:a="http://schemas.openxmlformats.org/drawingml/2006/main" noChangeAspect="1"/>
+                  </wp:cNvGraphicFramePr>
+                  <a:graphic xmlns:a="http://schemas.openxmlformats.org/drawingml/2006/main">
+                    <a:graphicData uri="http://schemas.openxmlformats.org/drawingml/2006/picture">
+                      <pic:pic xmlns:pic="http://schemas.openxmlformats.org/drawingml/2006/picture">
+                        <pic:nvPicPr>
+                          <pic:cNvPr id="1672155259" name=""/>
+                          <pic:cNvPicPr/>
+                        </pic:nvPicPr>
+                        <pic:blipFill>
+                          <a:blip r:embed="rId37"/>
+                          <a:stretch>
+                            <a:fillRect/>
+                          </a:stretch>
+                        </pic:blipFill>
+                        <pic:spPr>
+                          <a:xfrm>
+                            <a:off x="0" y="0"/>
+                            <a:ext cx="5943600" cy="5055235"/>
+                          </a:xfrm>
+                          <a:prstGeom prst="rect">
+                            <a:avLst/>
+                          </a:prstGeom>
+                        </pic:spPr>
+                      </pic:pic>
+                    </a:graphicData>
+                  </a:graphic>
+                </wp:inline>
+              </w:drawing>
             </w:r>
           </w:p>
           <w:p>
             <w:pPr>
               <w:ind w:left="115"/>
-            </w:pPr>
-            <w:r>
               <w:rPr>
                 <w:rFonts w:ascii="Calibri" w:eastAsia="Calibri" w:hAnsi="Calibri" w:cs="Calibri"/>
                 <w:b w:val="0"/>
@@ -2483,7 +2529,287 @@
                 <w:color w:val="1D2125"/>
                 <w:sz w:val="24"/>
               </w:rPr>
+            </w:pPr>
+            <w:r>
+              <w:rPr>
+                <w:rFonts w:ascii="Calibri" w:eastAsia="Calibri" w:hAnsi="Calibri" w:cs="Calibri"/>
+                <w:b w:val="0"/>
+                <w:i/>
+                <w:color w:val="1D2125"/>
+                <w:sz w:val="24"/>
+              </w:rPr>
+              <w:lastRenderedPageBreak/>
+              <w:drawing>
+                <wp:inline distT="0" distB="0" distL="0" distR="0" wp14:anchorId="404553CB" wp14:editId="3EAC6611">
+                  <wp:extent cx="5943600" cy="5633085"/>
+                  <wp:effectExtent l="0" t="0" r="0" b="5715"/>
+                  <wp:docPr id="1387668941" name="Picture 1"/>
+                  <wp:cNvGraphicFramePr>
+                    <a:graphicFrameLocks xmlns:a="http://schemas.openxmlformats.org/drawingml/2006/main" noChangeAspect="1"/>
+                  </wp:cNvGraphicFramePr>
+                  <a:graphic xmlns:a="http://schemas.openxmlformats.org/drawingml/2006/main">
+                    <a:graphicData uri="http://schemas.openxmlformats.org/drawingml/2006/picture">
+                      <pic:pic xmlns:pic="http://schemas.openxmlformats.org/drawingml/2006/picture">
+                        <pic:nvPicPr>
+                          <pic:cNvPr id="1387668941" name=""/>
+                          <pic:cNvPicPr/>
+                        </pic:nvPicPr>
+                        <pic:blipFill>
+                          <a:blip r:embed="rId38"/>
+                          <a:stretch>
+                            <a:fillRect/>
+                          </a:stretch>
+                        </pic:blipFill>
+                        <pic:spPr>
+                          <a:xfrm>
+                            <a:off x="0" y="0"/>
+                            <a:ext cx="5943600" cy="5633085"/>
+                          </a:xfrm>
+                          <a:prstGeom prst="rect">
+                            <a:avLst/>
+                          </a:prstGeom>
+                        </pic:spPr>
+                      </pic:pic>
+                    </a:graphicData>
+                  </a:graphic>
+                </wp:inline>
+              </w:drawing>
+            </w:r>
+          </w:p>
+          <w:p>
+            <w:pPr>
+              <w:ind w:left="115"/>
+              <w:rPr>
+                <w:rFonts w:ascii="Calibri" w:eastAsia="Calibri" w:hAnsi="Calibri" w:cs="Calibri"/>
+                <w:b w:val="0"/>
+                <w:i/>
+                <w:color w:val="1D2125"/>
+                <w:sz w:val="24"/>
+              </w:rPr>
+            </w:pPr>
+            <w:r>
+              <w:rPr>
+                <w:rFonts w:ascii="Calibri" w:eastAsia="Calibri" w:hAnsi="Calibri" w:cs="Calibri"/>
+                <w:b w:val="0"/>
+                <w:i/>
+                <w:color w:val="1D2125"/>
+                <w:sz w:val="24"/>
+              </w:rPr>
+              <w:lastRenderedPageBreak/>
+              <w:drawing>
+                <wp:inline distT="0" distB="0" distL="0" distR="0" wp14:anchorId="4D1EB257" wp14:editId="2DAC9DA1">
+                  <wp:extent cx="5943600" cy="4876165"/>
+                  <wp:effectExtent l="0" t="0" r="0" b="635"/>
+                  <wp:docPr id="1688147191" name="Picture 1"/>
+                  <wp:cNvGraphicFramePr>
+                    <a:graphicFrameLocks xmlns:a="http://schemas.openxmlformats.org/drawingml/2006/main" noChangeAspect="1"/>
+                  </wp:cNvGraphicFramePr>
+                  <a:graphic xmlns:a="http://schemas.openxmlformats.org/drawingml/2006/main">
+                    <a:graphicData uri="http://schemas.openxmlformats.org/drawingml/2006/picture">
+                      <pic:pic xmlns:pic="http://schemas.openxmlformats.org/drawingml/2006/picture">
+                        <pic:nvPicPr>
+                          <pic:cNvPr id="1688147191" name=""/>
+                          <pic:cNvPicPr/>
+                        </pic:nvPicPr>
+                        <pic:blipFill>
+                          <a:blip r:embed="rId39"/>
+                          <a:stretch>
+                            <a:fillRect/>
+                          </a:stretch>
+                        </pic:blipFill>
+                        <pic:spPr>
+                          <a:xfrm>
+                            <a:off x="0" y="0"/>
+                            <a:ext cx="5943600" cy="4876165"/>
+                          </a:xfrm>
+                          <a:prstGeom prst="rect">
+                            <a:avLst/>
+                          </a:prstGeom>
+                        </pic:spPr>
+                      </pic:pic>
+                    </a:graphicData>
+                  </a:graphic>
+                </wp:inline>
+              </w:drawing>
+            </w:r>
+          </w:p>
+          <w:p>
+            <w:pPr>
+              <w:ind w:left="115"/>
+              <w:rPr>
+                <w:rFonts w:ascii="Calibri" w:eastAsia="Calibri" w:hAnsi="Calibri" w:cs="Calibri"/>
+                <w:b w:val="0"/>
+                <w:i/>
+                <w:color w:val="1D2125"/>
+                <w:sz w:val="24"/>
+              </w:rPr>
+            </w:pPr>
+            <w:r>
+              <w:rPr>
+                <w:rFonts w:ascii="Calibri" w:eastAsia="Calibri" w:hAnsi="Calibri" w:cs="Calibri"/>
+                <w:b w:val="0"/>
+                <w:i/>
+                <w:color w:val="1D2125"/>
+                <w:sz w:val="24"/>
+              </w:rPr>
+              <w:lastRenderedPageBreak/>
+              <w:drawing>
+                <wp:inline distT="0" distB="0" distL="0" distR="0" wp14:anchorId="7DBB33CA" wp14:editId="11BEB74F">
+                  <wp:extent cx="5943600" cy="5204460"/>
+                  <wp:effectExtent l="0" t="0" r="0" b="0"/>
+                  <wp:docPr id="1539745404" name="Picture 1"/>
+                  <wp:cNvGraphicFramePr>
+                    <a:graphicFrameLocks xmlns:a="http://schemas.openxmlformats.org/drawingml/2006/main" noChangeAspect="1"/>
+                  </wp:cNvGraphicFramePr>
+                  <a:graphic xmlns:a="http://schemas.openxmlformats.org/drawingml/2006/main">
+                    <a:graphicData uri="http://schemas.openxmlformats.org/drawingml/2006/picture">
+                      <pic:pic xmlns:pic="http://schemas.openxmlformats.org/drawingml/2006/picture">
+                        <pic:nvPicPr>
+                          <pic:cNvPr id="1539745404" name=""/>
+                          <pic:cNvPicPr/>
+                        </pic:nvPicPr>
+                        <pic:blipFill>
+                          <a:blip r:embed="rId40"/>
+                          <a:stretch>
+                            <a:fillRect/>
+                          </a:stretch>
+                        </pic:blipFill>
+                        <pic:spPr>
+                          <a:xfrm>
+                            <a:off x="0" y="0"/>
+                            <a:ext cx="5943600" cy="5204460"/>
+                          </a:xfrm>
+                          <a:prstGeom prst="rect">
+                            <a:avLst/>
+                          </a:prstGeom>
+                        </pic:spPr>
+                      </pic:pic>
+                    </a:graphicData>
+                  </a:graphic>
+                </wp:inline>
+              </w:drawing>
+            </w:r>
+          </w:p>
+          <w:p>
+            <w:pPr>
+              <w:ind w:left="115"/>
+              <w:rPr>
+                <w:rFonts w:ascii="Calibri" w:eastAsia="Calibri" w:hAnsi="Calibri" w:cs="Calibri"/>
+                <w:b w:val="0"/>
+                <w:i/>
+                <w:color w:val="1D2125"/>
+                <w:sz w:val="24"/>
+              </w:rPr>
+            </w:pPr>
+          </w:p>
+          <w:p>
+            <w:pPr>
+              <w:ind w:left="0"/>
+              <w:rPr>
+                <w:rFonts w:ascii="Calibri" w:eastAsia="Calibri" w:hAnsi="Calibri" w:cs="Calibri"/>
+                <w:b w:val="0"/>
+                <w:i/>
+                <w:color w:val="1D2125"/>
+                <w:sz w:val="24"/>
+              </w:rPr>
+            </w:pPr>
+            <w:r>
+              <w:rPr>
+                <w:rFonts w:ascii="Calibri" w:eastAsia="Calibri" w:hAnsi="Calibri" w:cs="Calibri"/>
+                <w:b w:val="0"/>
+                <w:i/>
+                <w:color w:val="1D2125"/>
+                <w:sz w:val="24"/>
+              </w:rPr>
+              <w:lastRenderedPageBreak/>
+              <w:drawing>
+                <wp:inline distT="0" distB="0" distL="0" distR="0" wp14:anchorId="70FC673C" wp14:editId="1E114D47">
+                  <wp:extent cx="5943600" cy="5584825"/>
+                  <wp:effectExtent l="0" t="0" r="0" b="0"/>
+                  <wp:docPr id="689177999" name="Picture 1"/>
+                  <wp:cNvGraphicFramePr>
+                    <a:graphicFrameLocks xmlns:a="http://schemas.openxmlformats.org/drawingml/2006/main" noChangeAspect="1"/>
+                  </wp:cNvGraphicFramePr>
+                  <a:graphic xmlns:a="http://schemas.openxmlformats.org/drawingml/2006/main">
+                    <a:graphicData uri="http://schemas.openxmlformats.org/drawingml/2006/picture">
+                      <pic:pic xmlns:pic="http://schemas.openxmlformats.org/drawingml/2006/picture">
+                        <pic:nvPicPr>
+                          <pic:cNvPr id="689177999" name=""/>
+                          <pic:cNvPicPr/>
+                        </pic:nvPicPr>
+                        <pic:blipFill>
+                          <a:blip r:embed="rId41"/>
+                          <a:stretch>
+                            <a:fillRect/>
+                          </a:stretch>
+                        </pic:blipFill>
+                        <pic:spPr>
+                          <a:xfrm>
+                            <a:off x="0" y="0"/>
+                            <a:ext cx="5943600" cy="5584825"/>
+                          </a:xfrm>
+                          <a:prstGeom prst="rect">
+                            <a:avLst/>
+                          </a:prstGeom>
+                        </pic:spPr>
+                      </pic:pic>
+                    </a:graphicData>
+                  </a:graphic>
+                </wp:inline>
+              </w:drawing>
+            </w:r>
+            <w:r>
+              <w:rPr>
+                <w:rFonts w:ascii="Calibri" w:eastAsia="Calibri" w:hAnsi="Calibri" w:cs="Calibri"/>
+                <w:b w:val="0"/>
+                <w:i/>
+                <w:color w:val="1D2125"/>
+                <w:sz w:val="24"/>
+              </w:rPr>
               <w:t xml:space="preserve"> </w:t>
+            </w:r>
+          </w:p>
+          <w:p>
+            <w:pPr>
+              <w:ind w:left="0"/>
+            </w:pPr>
+            <w:r>
+              <w:lastRenderedPageBreak/>
+              <w:drawing>
+                <wp:inline distT="0" distB="0" distL="0" distR="0" wp14:anchorId="26869924" wp14:editId="14ADCB4E">
+                  <wp:extent cx="5943600" cy="5054600"/>
+                  <wp:effectExtent l="0" t="0" r="0" b="0"/>
+                  <wp:docPr id="538023328" name="Picture 1"/>
+                  <wp:cNvGraphicFramePr>
+                    <a:graphicFrameLocks xmlns:a="http://schemas.openxmlformats.org/drawingml/2006/main" noChangeAspect="1"/>
+                  </wp:cNvGraphicFramePr>
+                  <a:graphic xmlns:a="http://schemas.openxmlformats.org/drawingml/2006/main">
+                    <a:graphicData uri="http://schemas.openxmlformats.org/drawingml/2006/picture">
+                      <pic:pic xmlns:pic="http://schemas.openxmlformats.org/drawingml/2006/picture">
+                        <pic:nvPicPr>
+                          <pic:cNvPr id="538023328" name=""/>
+                          <pic:cNvPicPr/>
+                        </pic:nvPicPr>
+                        <pic:blipFill>
+                          <a:blip r:embed="rId42"/>
+                          <a:stretch>
+                            <a:fillRect/>
+                          </a:stretch>
+                        </pic:blipFill>
+                        <pic:spPr>
+                          <a:xfrm>
+                            <a:off x="0" y="0"/>
+                            <a:ext cx="5943600" cy="5054600"/>
+                          </a:xfrm>
+                          <a:prstGeom prst="rect">
+                            <a:avLst/>
+                          </a:prstGeom>
+                        </pic:spPr>
+                      </pic:pic>
+                    </a:graphicData>
+                  </a:graphic>
+                </wp:inline>
+              </w:drawing>
             </w:r>
           </w:p>
         </w:tc>
@@ -2505,6 +2831,7 @@
               <w:rPr>
                 <w:b w:val="0"/>
               </w:rPr>
+              <w:lastRenderedPageBreak/>
               <w:t xml:space="preserve"> </w:t>
             </w:r>
           </w:p>
@@ -2535,6 +2862,7 @@
                 <w:color w:val="1D2125"/>
                 <w:sz w:val="24"/>
               </w:rPr>
+              <w:lastRenderedPageBreak/>
               <w:t xml:space="preserve">Summary of the prototype </w:t>
             </w:r>
           </w:p>
@@ -2588,16 +2916,7 @@
           </w:tcPr>
           <w:p>
             <w:r>
-              <w:lastRenderedPageBreak/>
-              <w:t xml:space="preserve">To design </w:t>
-            </w:r>
-            <w:proofErr w:type="spellStart"/>
-            <w:r>
-              <w:t>YourAverageGamer</w:t>
-            </w:r>
-            <w:proofErr w:type="spellEnd"/>
-            <w:r>
-              <w:t xml:space="preserve"> webpage, the team decided to take </w:t>
+              <w:t xml:space="preserve">To design YourAverageGamer webpage, the team decided to take </w:t>
             </w:r>
             <w:proofErr w:type="gramStart"/>
             <w:r>
@@ -3111,7 +3430,6 @@
   <w:style w:type="character" w:default="1" w:styleId="DefaultParagraphFont">
     <w:name w:val="Default Paragraph Font"/>
     <w:uiPriority w:val="1"/>
-    <w:semiHidden/>
     <w:unhideWhenUsed/>
   </w:style>
   <w:style w:type="table" w:default="1" w:styleId="TableNormal">

</xml_diff>